<commit_message>
Remove mentorship block from research paper title page
</commit_message>
<xml_diff>
--- a/reports/research_paper.docx
+++ b/reports/research_paper.docx
@@ -76,7 +76,7 @@
     </w:p>
     <w:p>
       <w:pPr>
-        <w:spacing w:after="600"/>
+        <w:spacing w:after="1200"/>
         <w:jc w:val="center"/>
       </w:pPr>
       <w:r>
@@ -85,28 +85,6 @@
           <w:sz w:val="28"/>
         </w:rPr>
         <w:t>SHUBHANGI PANDEY</w:t>
-      </w:r>
-    </w:p>
-    <w:p>
-      <w:pPr>
-        <w:spacing w:after="40"/>
-        <w:jc w:val="center"/>
-      </w:pPr>
-      <w:r>
-        <w:t>Under the mentorship of</w:t>
-      </w:r>
-    </w:p>
-    <w:p>
-      <w:pPr>
-        <w:spacing w:after="800"/>
-        <w:jc w:val="center"/>
-      </w:pPr>
-      <w:r>
-        <w:rPr>
-          <w:b/>
-          <w:sz w:val="26"/>
-        </w:rPr>
-        <w:t>Unified Mentor</w:t>
       </w:r>
     </w:p>
     <w:p>
@@ -280,7 +258,7 @@
       <w:r>
         <w:fldChar w:fldCharType="separate"/>
       </w:r>
-      <w:hyperlink w:anchor="_Toc235719399" w:history="1">
+      <w:hyperlink w:anchor="_Toc235720185" w:history="1">
         <w:r>
           <w:rPr>
             <w:rStyle w:val="Hyperlink"/>
@@ -307,7 +285,7 @@
             <w:noProof/>
             <w:webHidden/>
           </w:rPr>
-          <w:instrText xml:space="preserve"> PAGEREF _Toc235719399 \h </w:instrText>
+          <w:instrText xml:space="preserve"> PAGEREF _Toc235720185 \h </w:instrText>
         </w:r>
         <w:r>
           <w:rPr>
@@ -354,7 +332,7 @@
           <w14:ligatures w14:val="standardContextual"/>
         </w:rPr>
       </w:pPr>
-      <w:hyperlink w:anchor="_Toc235719400" w:history="1">
+      <w:hyperlink w:anchor="_Toc235720186" w:history="1">
         <w:r>
           <w:rPr>
             <w:rStyle w:val="Hyperlink"/>
@@ -381,7 +359,7 @@
             <w:noProof/>
             <w:webHidden/>
           </w:rPr>
-          <w:instrText xml:space="preserve"> PAGEREF _Toc235719400 \h </w:instrText>
+          <w:instrText xml:space="preserve"> PAGEREF _Toc235720186 \h </w:instrText>
         </w:r>
         <w:r>
           <w:rPr>
@@ -428,7 +406,7 @@
           <w14:ligatures w14:val="standardContextual"/>
         </w:rPr>
       </w:pPr>
-      <w:hyperlink w:anchor="_Toc235719401" w:history="1">
+      <w:hyperlink w:anchor="_Toc235720187" w:history="1">
         <w:r>
           <w:rPr>
             <w:rStyle w:val="Hyperlink"/>
@@ -455,7 +433,7 @@
             <w:noProof/>
             <w:webHidden/>
           </w:rPr>
-          <w:instrText xml:space="preserve"> PAGEREF _Toc235719401 \h </w:instrText>
+          <w:instrText xml:space="preserve"> PAGEREF _Toc235720187 \h </w:instrText>
         </w:r>
         <w:r>
           <w:rPr>
@@ -502,7 +480,7 @@
           <w14:ligatures w14:val="standardContextual"/>
         </w:rPr>
       </w:pPr>
-      <w:hyperlink w:anchor="_Toc235719402" w:history="1">
+      <w:hyperlink w:anchor="_Toc235720188" w:history="1">
         <w:r>
           <w:rPr>
             <w:rStyle w:val="Hyperlink"/>
@@ -529,7 +507,7 @@
             <w:noProof/>
             <w:webHidden/>
           </w:rPr>
-          <w:instrText xml:space="preserve"> PAGEREF _Toc235719402 \h </w:instrText>
+          <w:instrText xml:space="preserve"> PAGEREF _Toc235720188 \h </w:instrText>
         </w:r>
         <w:r>
           <w:rPr>
@@ -576,7 +554,7 @@
           <w14:ligatures w14:val="standardContextual"/>
         </w:rPr>
       </w:pPr>
-      <w:hyperlink w:anchor="_Toc235719403" w:history="1">
+      <w:hyperlink w:anchor="_Toc235720189" w:history="1">
         <w:r>
           <w:rPr>
             <w:rStyle w:val="Hyperlink"/>
@@ -603,7 +581,7 @@
             <w:noProof/>
             <w:webHidden/>
           </w:rPr>
-          <w:instrText xml:space="preserve"> PAGEREF _Toc235719403 \h </w:instrText>
+          <w:instrText xml:space="preserve"> PAGEREF _Toc235720189 \h </w:instrText>
         </w:r>
         <w:r>
           <w:rPr>
@@ -650,7 +628,7 @@
           <w14:ligatures w14:val="standardContextual"/>
         </w:rPr>
       </w:pPr>
-      <w:hyperlink w:anchor="_Toc235719404" w:history="1">
+      <w:hyperlink w:anchor="_Toc235720190" w:history="1">
         <w:r>
           <w:rPr>
             <w:rStyle w:val="Hyperlink"/>
@@ -677,7 +655,7 @@
             <w:noProof/>
             <w:webHidden/>
           </w:rPr>
-          <w:instrText xml:space="preserve"> PAGEREF _Toc235719404 \h </w:instrText>
+          <w:instrText xml:space="preserve"> PAGEREF _Toc235720190 \h </w:instrText>
         </w:r>
         <w:r>
           <w:rPr>
@@ -724,7 +702,7 @@
           <w14:ligatures w14:val="standardContextual"/>
         </w:rPr>
       </w:pPr>
-      <w:hyperlink w:anchor="_Toc235719405" w:history="1">
+      <w:hyperlink w:anchor="_Toc235720191" w:history="1">
         <w:r>
           <w:rPr>
             <w:rStyle w:val="Hyperlink"/>
@@ -751,7 +729,7 @@
             <w:noProof/>
             <w:webHidden/>
           </w:rPr>
-          <w:instrText xml:space="preserve"> PAGEREF _Toc235719405 \h </w:instrText>
+          <w:instrText xml:space="preserve"> PAGEREF _Toc235720191 \h </w:instrText>
         </w:r>
         <w:r>
           <w:rPr>
@@ -798,7 +776,7 @@
           <w14:ligatures w14:val="standardContextual"/>
         </w:rPr>
       </w:pPr>
-      <w:hyperlink w:anchor="_Toc235719406" w:history="1">
+      <w:hyperlink w:anchor="_Toc235720192" w:history="1">
         <w:r>
           <w:rPr>
             <w:rStyle w:val="Hyperlink"/>
@@ -825,7 +803,7 @@
             <w:noProof/>
             <w:webHidden/>
           </w:rPr>
-          <w:instrText xml:space="preserve"> PAGEREF _Toc235719406 \h </w:instrText>
+          <w:instrText xml:space="preserve"> PAGEREF _Toc235720192 \h </w:instrText>
         </w:r>
         <w:r>
           <w:rPr>
@@ -872,7 +850,7 @@
           <w14:ligatures w14:val="standardContextual"/>
         </w:rPr>
       </w:pPr>
-      <w:hyperlink w:anchor="_Toc235719407" w:history="1">
+      <w:hyperlink w:anchor="_Toc235720193" w:history="1">
         <w:r>
           <w:rPr>
             <w:rStyle w:val="Hyperlink"/>
@@ -899,7 +877,7 @@
             <w:noProof/>
             <w:webHidden/>
           </w:rPr>
-          <w:instrText xml:space="preserve"> PAGEREF _Toc235719407 \h </w:instrText>
+          <w:instrText xml:space="preserve"> PAGEREF _Toc235720193 \h </w:instrText>
         </w:r>
         <w:r>
           <w:rPr>
@@ -946,7 +924,7 @@
           <w14:ligatures w14:val="standardContextual"/>
         </w:rPr>
       </w:pPr>
-      <w:hyperlink w:anchor="_Toc235719408" w:history="1">
+      <w:hyperlink w:anchor="_Toc235720194" w:history="1">
         <w:r>
           <w:rPr>
             <w:rStyle w:val="Hyperlink"/>
@@ -973,7 +951,7 @@
             <w:noProof/>
             <w:webHidden/>
           </w:rPr>
-          <w:instrText xml:space="preserve"> PAGEREF _Toc235719408 \h </w:instrText>
+          <w:instrText xml:space="preserve"> PAGEREF _Toc235720194 \h </w:instrText>
         </w:r>
         <w:r>
           <w:rPr>
@@ -1020,7 +998,7 @@
           <w14:ligatures w14:val="standardContextual"/>
         </w:rPr>
       </w:pPr>
-      <w:hyperlink w:anchor="_Toc235719409" w:history="1">
+      <w:hyperlink w:anchor="_Toc235720195" w:history="1">
         <w:r>
           <w:rPr>
             <w:rStyle w:val="Hyperlink"/>
@@ -1047,7 +1025,7 @@
             <w:noProof/>
             <w:webHidden/>
           </w:rPr>
-          <w:instrText xml:space="preserve"> PAGEREF _Toc235719409 \h </w:instrText>
+          <w:instrText xml:space="preserve"> PAGEREF _Toc235720195 \h </w:instrText>
         </w:r>
         <w:r>
           <w:rPr>
@@ -1094,7 +1072,7 @@
           <w14:ligatures w14:val="standardContextual"/>
         </w:rPr>
       </w:pPr>
-      <w:hyperlink w:anchor="_Toc235719410" w:history="1">
+      <w:hyperlink w:anchor="_Toc235720196" w:history="1">
         <w:r>
           <w:rPr>
             <w:rStyle w:val="Hyperlink"/>
@@ -1121,7 +1099,7 @@
             <w:noProof/>
             <w:webHidden/>
           </w:rPr>
-          <w:instrText xml:space="preserve"> PAGEREF _Toc235719410 \h </w:instrText>
+          <w:instrText xml:space="preserve"> PAGEREF _Toc235720196 \h </w:instrText>
         </w:r>
         <w:r>
           <w:rPr>
@@ -1168,7 +1146,7 @@
           <w14:ligatures w14:val="standardContextual"/>
         </w:rPr>
       </w:pPr>
-      <w:hyperlink w:anchor="_Toc235719411" w:history="1">
+      <w:hyperlink w:anchor="_Toc235720197" w:history="1">
         <w:r>
           <w:rPr>
             <w:rStyle w:val="Hyperlink"/>
@@ -1195,7 +1173,7 @@
             <w:noProof/>
             <w:webHidden/>
           </w:rPr>
-          <w:instrText xml:space="preserve"> PAGEREF _Toc235719411 \h </w:instrText>
+          <w:instrText xml:space="preserve"> PAGEREF _Toc235720197 \h </w:instrText>
         </w:r>
         <w:r>
           <w:rPr>
@@ -1242,7 +1220,7 @@
           <w14:ligatures w14:val="standardContextual"/>
         </w:rPr>
       </w:pPr>
-      <w:hyperlink w:anchor="_Toc235719412" w:history="1">
+      <w:hyperlink w:anchor="_Toc235720198" w:history="1">
         <w:r>
           <w:rPr>
             <w:rStyle w:val="Hyperlink"/>
@@ -1269,7 +1247,7 @@
             <w:noProof/>
             <w:webHidden/>
           </w:rPr>
-          <w:instrText xml:space="preserve"> PAGEREF _Toc235719412 \h </w:instrText>
+          <w:instrText xml:space="preserve"> PAGEREF _Toc235720198 \h </w:instrText>
         </w:r>
         <w:r>
           <w:rPr>
@@ -1316,7 +1294,7 @@
           <w14:ligatures w14:val="standardContextual"/>
         </w:rPr>
       </w:pPr>
-      <w:hyperlink w:anchor="_Toc235719413" w:history="1">
+      <w:hyperlink w:anchor="_Toc235720199" w:history="1">
         <w:r>
           <w:rPr>
             <w:rStyle w:val="Hyperlink"/>
@@ -1343,7 +1321,7 @@
             <w:noProof/>
             <w:webHidden/>
           </w:rPr>
-          <w:instrText xml:space="preserve"> PAGEREF _Toc235719413 \h </w:instrText>
+          <w:instrText xml:space="preserve"> PAGEREF _Toc235720199 \h </w:instrText>
         </w:r>
         <w:r>
           <w:rPr>
@@ -1390,7 +1368,7 @@
           <w14:ligatures w14:val="standardContextual"/>
         </w:rPr>
       </w:pPr>
-      <w:hyperlink w:anchor="_Toc235719414" w:history="1">
+      <w:hyperlink w:anchor="_Toc235720200" w:history="1">
         <w:r>
           <w:rPr>
             <w:rStyle w:val="Hyperlink"/>
@@ -1417,7 +1395,7 @@
             <w:noProof/>
             <w:webHidden/>
           </w:rPr>
-          <w:instrText xml:space="preserve"> PAGEREF _Toc235719414 \h </w:instrText>
+          <w:instrText xml:space="preserve"> PAGEREF _Toc235720200 \h </w:instrText>
         </w:r>
         <w:r>
           <w:rPr>
@@ -1464,7 +1442,7 @@
           <w14:ligatures w14:val="standardContextual"/>
         </w:rPr>
       </w:pPr>
-      <w:hyperlink w:anchor="_Toc235719415" w:history="1">
+      <w:hyperlink w:anchor="_Toc235720201" w:history="1">
         <w:r>
           <w:rPr>
             <w:rStyle w:val="Hyperlink"/>
@@ -1491,7 +1469,7 @@
             <w:noProof/>
             <w:webHidden/>
           </w:rPr>
-          <w:instrText xml:space="preserve"> PAGEREF _Toc235719415 \h </w:instrText>
+          <w:instrText xml:space="preserve"> PAGEREF _Toc235720201 \h </w:instrText>
         </w:r>
         <w:r>
           <w:rPr>
@@ -1538,7 +1516,7 @@
           <w14:ligatures w14:val="standardContextual"/>
         </w:rPr>
       </w:pPr>
-      <w:hyperlink w:anchor="_Toc235719416" w:history="1">
+      <w:hyperlink w:anchor="_Toc235720202" w:history="1">
         <w:r>
           <w:rPr>
             <w:rStyle w:val="Hyperlink"/>
@@ -1565,7 +1543,7 @@
             <w:noProof/>
             <w:webHidden/>
           </w:rPr>
-          <w:instrText xml:space="preserve"> PAGEREF _Toc235719416 \h </w:instrText>
+          <w:instrText xml:space="preserve"> PAGEREF _Toc235720202 \h </w:instrText>
         </w:r>
         <w:r>
           <w:rPr>
@@ -1612,7 +1590,7 @@
           <w14:ligatures w14:val="standardContextual"/>
         </w:rPr>
       </w:pPr>
-      <w:hyperlink w:anchor="_Toc235719417" w:history="1">
+      <w:hyperlink w:anchor="_Toc235720203" w:history="1">
         <w:r>
           <w:rPr>
             <w:rStyle w:val="Hyperlink"/>
@@ -1639,7 +1617,7 @@
             <w:noProof/>
             <w:webHidden/>
           </w:rPr>
-          <w:instrText xml:space="preserve"> PAGEREF _Toc235719417 \h </w:instrText>
+          <w:instrText xml:space="preserve"> PAGEREF _Toc235720203 \h </w:instrText>
         </w:r>
         <w:r>
           <w:rPr>
@@ -1686,7 +1664,7 @@
           <w14:ligatures w14:val="standardContextual"/>
         </w:rPr>
       </w:pPr>
-      <w:hyperlink w:anchor="_Toc235719418" w:history="1">
+      <w:hyperlink w:anchor="_Toc235720204" w:history="1">
         <w:r>
           <w:rPr>
             <w:rStyle w:val="Hyperlink"/>
@@ -1713,7 +1691,7 @@
             <w:noProof/>
             <w:webHidden/>
           </w:rPr>
-          <w:instrText xml:space="preserve"> PAGEREF _Toc235719418 \h </w:instrText>
+          <w:instrText xml:space="preserve"> PAGEREF _Toc235720204 \h </w:instrText>
         </w:r>
         <w:r>
           <w:rPr>
@@ -1760,7 +1738,7 @@
           <w14:ligatures w14:val="standardContextual"/>
         </w:rPr>
       </w:pPr>
-      <w:hyperlink w:anchor="_Toc235719419" w:history="1">
+      <w:hyperlink w:anchor="_Toc235720205" w:history="1">
         <w:r>
           <w:rPr>
             <w:rStyle w:val="Hyperlink"/>
@@ -1787,7 +1765,7 @@
             <w:noProof/>
             <w:webHidden/>
           </w:rPr>
-          <w:instrText xml:space="preserve"> PAGEREF _Toc235719419 \h </w:instrText>
+          <w:instrText xml:space="preserve"> PAGEREF _Toc235720205 \h </w:instrText>
         </w:r>
         <w:r>
           <w:rPr>
@@ -1834,7 +1812,7 @@
           <w14:ligatures w14:val="standardContextual"/>
         </w:rPr>
       </w:pPr>
-      <w:hyperlink w:anchor="_Toc235719420" w:history="1">
+      <w:hyperlink w:anchor="_Toc235720206" w:history="1">
         <w:r>
           <w:rPr>
             <w:rStyle w:val="Hyperlink"/>
@@ -1861,7 +1839,7 @@
             <w:noProof/>
             <w:webHidden/>
           </w:rPr>
-          <w:instrText xml:space="preserve"> PAGEREF _Toc235719420 \h </w:instrText>
+          <w:instrText xml:space="preserve"> PAGEREF _Toc235720206 \h </w:instrText>
         </w:r>
         <w:r>
           <w:rPr>
@@ -1908,7 +1886,7 @@
           <w14:ligatures w14:val="standardContextual"/>
         </w:rPr>
       </w:pPr>
-      <w:hyperlink w:anchor="_Toc235719421" w:history="1">
+      <w:hyperlink w:anchor="_Toc235720207" w:history="1">
         <w:r>
           <w:rPr>
             <w:rStyle w:val="Hyperlink"/>
@@ -1935,7 +1913,7 @@
             <w:noProof/>
             <w:webHidden/>
           </w:rPr>
-          <w:instrText xml:space="preserve"> PAGEREF _Toc235719421 \h </w:instrText>
+          <w:instrText xml:space="preserve"> PAGEREF _Toc235720207 \h </w:instrText>
         </w:r>
         <w:r>
           <w:rPr>
@@ -1982,7 +1960,7 @@
           <w14:ligatures w14:val="standardContextual"/>
         </w:rPr>
       </w:pPr>
-      <w:hyperlink w:anchor="_Toc235719422" w:history="1">
+      <w:hyperlink w:anchor="_Toc235720208" w:history="1">
         <w:r>
           <w:rPr>
             <w:rStyle w:val="Hyperlink"/>
@@ -2009,7 +1987,7 @@
             <w:noProof/>
             <w:webHidden/>
           </w:rPr>
-          <w:instrText xml:space="preserve"> PAGEREF _Toc235719422 \h </w:instrText>
+          <w:instrText xml:space="preserve"> PAGEREF _Toc235720208 \h </w:instrText>
         </w:r>
         <w:r>
           <w:rPr>
@@ -2056,7 +2034,7 @@
           <w14:ligatures w14:val="standardContextual"/>
         </w:rPr>
       </w:pPr>
-      <w:hyperlink w:anchor="_Toc235719423" w:history="1">
+      <w:hyperlink w:anchor="_Toc235720209" w:history="1">
         <w:r>
           <w:rPr>
             <w:rStyle w:val="Hyperlink"/>
@@ -2083,7 +2061,7 @@
             <w:noProof/>
             <w:webHidden/>
           </w:rPr>
-          <w:instrText xml:space="preserve"> PAGEREF _Toc235719423 \h </w:instrText>
+          <w:instrText xml:space="preserve"> PAGEREF _Toc235720209 \h </w:instrText>
         </w:r>
         <w:r>
           <w:rPr>
@@ -2130,7 +2108,7 @@
           <w14:ligatures w14:val="standardContextual"/>
         </w:rPr>
       </w:pPr>
-      <w:hyperlink w:anchor="_Toc235719424" w:history="1">
+      <w:hyperlink w:anchor="_Toc235720210" w:history="1">
         <w:r>
           <w:rPr>
             <w:rStyle w:val="Hyperlink"/>
@@ -2157,7 +2135,7 @@
             <w:noProof/>
             <w:webHidden/>
           </w:rPr>
-          <w:instrText xml:space="preserve"> PAGEREF _Toc235719424 \h </w:instrText>
+          <w:instrText xml:space="preserve"> PAGEREF _Toc235720210 \h </w:instrText>
         </w:r>
         <w:r>
           <w:rPr>
@@ -2204,7 +2182,7 @@
           <w14:ligatures w14:val="standardContextual"/>
         </w:rPr>
       </w:pPr>
-      <w:hyperlink w:anchor="_Toc235719425" w:history="1">
+      <w:hyperlink w:anchor="_Toc235720211" w:history="1">
         <w:r>
           <w:rPr>
             <w:rStyle w:val="Hyperlink"/>
@@ -2231,7 +2209,7 @@
             <w:noProof/>
             <w:webHidden/>
           </w:rPr>
-          <w:instrText xml:space="preserve"> PAGEREF _Toc235719425 \h </w:instrText>
+          <w:instrText xml:space="preserve"> PAGEREF _Toc235720211 \h </w:instrText>
         </w:r>
         <w:r>
           <w:rPr>
@@ -2278,7 +2256,7 @@
           <w14:ligatures w14:val="standardContextual"/>
         </w:rPr>
       </w:pPr>
-      <w:hyperlink w:anchor="_Toc235719426" w:history="1">
+      <w:hyperlink w:anchor="_Toc235720212" w:history="1">
         <w:r>
           <w:rPr>
             <w:rStyle w:val="Hyperlink"/>
@@ -2305,7 +2283,7 @@
             <w:noProof/>
             <w:webHidden/>
           </w:rPr>
-          <w:instrText xml:space="preserve"> PAGEREF _Toc235719426 \h </w:instrText>
+          <w:instrText xml:space="preserve"> PAGEREF _Toc235720212 \h </w:instrText>
         </w:r>
         <w:r>
           <w:rPr>
@@ -2352,7 +2330,7 @@
           <w14:ligatures w14:val="standardContextual"/>
         </w:rPr>
       </w:pPr>
-      <w:hyperlink w:anchor="_Toc235719427" w:history="1">
+      <w:hyperlink w:anchor="_Toc235720213" w:history="1">
         <w:r>
           <w:rPr>
             <w:rStyle w:val="Hyperlink"/>
@@ -2379,7 +2357,7 @@
             <w:noProof/>
             <w:webHidden/>
           </w:rPr>
-          <w:instrText xml:space="preserve"> PAGEREF _Toc235719427 \h </w:instrText>
+          <w:instrText xml:space="preserve"> PAGEREF _Toc235720213 \h </w:instrText>
         </w:r>
         <w:r>
           <w:rPr>
@@ -2426,7 +2404,7 @@
           <w14:ligatures w14:val="standardContextual"/>
         </w:rPr>
       </w:pPr>
-      <w:hyperlink w:anchor="_Toc235719428" w:history="1">
+      <w:hyperlink w:anchor="_Toc235720214" w:history="1">
         <w:r>
           <w:rPr>
             <w:rStyle w:val="Hyperlink"/>
@@ -2453,7 +2431,7 @@
             <w:noProof/>
             <w:webHidden/>
           </w:rPr>
-          <w:instrText xml:space="preserve"> PAGEREF _Toc235719428 \h </w:instrText>
+          <w:instrText xml:space="preserve"> PAGEREF _Toc235720214 \h </w:instrText>
         </w:r>
         <w:r>
           <w:rPr>
@@ -2500,7 +2478,7 @@
           <w14:ligatures w14:val="standardContextual"/>
         </w:rPr>
       </w:pPr>
-      <w:hyperlink w:anchor="_Toc235719429" w:history="1">
+      <w:hyperlink w:anchor="_Toc235720215" w:history="1">
         <w:r>
           <w:rPr>
             <w:rStyle w:val="Hyperlink"/>
@@ -2527,7 +2505,7 @@
             <w:noProof/>
             <w:webHidden/>
           </w:rPr>
-          <w:instrText xml:space="preserve"> PAGEREF _Toc235719429 \h </w:instrText>
+          <w:instrText xml:space="preserve"> PAGEREF _Toc235720215 \h </w:instrText>
         </w:r>
         <w:r>
           <w:rPr>
@@ -2574,7 +2552,7 @@
           <w14:ligatures w14:val="standardContextual"/>
         </w:rPr>
       </w:pPr>
-      <w:hyperlink w:anchor="_Toc235719430" w:history="1">
+      <w:hyperlink w:anchor="_Toc235720216" w:history="1">
         <w:r>
           <w:rPr>
             <w:rStyle w:val="Hyperlink"/>
@@ -2601,7 +2579,7 @@
             <w:noProof/>
             <w:webHidden/>
           </w:rPr>
-          <w:instrText xml:space="preserve"> PAGEREF _Toc235719430 \h </w:instrText>
+          <w:instrText xml:space="preserve"> PAGEREF _Toc235720216 \h </w:instrText>
         </w:r>
         <w:r>
           <w:rPr>
@@ -2648,7 +2626,7 @@
           <w14:ligatures w14:val="standardContextual"/>
         </w:rPr>
       </w:pPr>
-      <w:hyperlink w:anchor="_Toc235719431" w:history="1">
+      <w:hyperlink w:anchor="_Toc235720217" w:history="1">
         <w:r>
           <w:rPr>
             <w:rStyle w:val="Hyperlink"/>
@@ -2675,7 +2653,7 @@
             <w:noProof/>
             <w:webHidden/>
           </w:rPr>
-          <w:instrText xml:space="preserve"> PAGEREF _Toc235719431 \h </w:instrText>
+          <w:instrText xml:space="preserve"> PAGEREF _Toc235720217 \h </w:instrText>
         </w:r>
         <w:r>
           <w:rPr>
@@ -2722,7 +2700,7 @@
           <w14:ligatures w14:val="standardContextual"/>
         </w:rPr>
       </w:pPr>
-      <w:hyperlink w:anchor="_Toc235719432" w:history="1">
+      <w:hyperlink w:anchor="_Toc235720218" w:history="1">
         <w:r>
           <w:rPr>
             <w:rStyle w:val="Hyperlink"/>
@@ -2749,7 +2727,7 @@
             <w:noProof/>
             <w:webHidden/>
           </w:rPr>
-          <w:instrText xml:space="preserve"> PAGEREF _Toc235719432 \h </w:instrText>
+          <w:instrText xml:space="preserve"> PAGEREF _Toc235720218 \h </w:instrText>
         </w:r>
         <w:r>
           <w:rPr>
@@ -2796,7 +2774,7 @@
           <w14:ligatures w14:val="standardContextual"/>
         </w:rPr>
       </w:pPr>
-      <w:hyperlink w:anchor="_Toc235719433" w:history="1">
+      <w:hyperlink w:anchor="_Toc235720219" w:history="1">
         <w:r>
           <w:rPr>
             <w:rStyle w:val="Hyperlink"/>
@@ -2823,7 +2801,7 @@
             <w:noProof/>
             <w:webHidden/>
           </w:rPr>
-          <w:instrText xml:space="preserve"> PAGEREF _Toc235719433 \h </w:instrText>
+          <w:instrText xml:space="preserve"> PAGEREF _Toc235720219 \h </w:instrText>
         </w:r>
         <w:r>
           <w:rPr>
@@ -2870,7 +2848,7 @@
           <w14:ligatures w14:val="standardContextual"/>
         </w:rPr>
       </w:pPr>
-      <w:hyperlink w:anchor="_Toc235719434" w:history="1">
+      <w:hyperlink w:anchor="_Toc235720220" w:history="1">
         <w:r>
           <w:rPr>
             <w:rStyle w:val="Hyperlink"/>
@@ -2897,7 +2875,7 @@
             <w:noProof/>
             <w:webHidden/>
           </w:rPr>
-          <w:instrText xml:space="preserve"> PAGEREF _Toc235719434 \h </w:instrText>
+          <w:instrText xml:space="preserve"> PAGEREF _Toc235720220 \h </w:instrText>
         </w:r>
         <w:r>
           <w:rPr>
@@ -2944,7 +2922,7 @@
           <w14:ligatures w14:val="standardContextual"/>
         </w:rPr>
       </w:pPr>
-      <w:hyperlink w:anchor="_Toc235719435" w:history="1">
+      <w:hyperlink w:anchor="_Toc235720221" w:history="1">
         <w:r>
           <w:rPr>
             <w:rStyle w:val="Hyperlink"/>
@@ -2971,7 +2949,7 @@
             <w:noProof/>
             <w:webHidden/>
           </w:rPr>
-          <w:instrText xml:space="preserve"> PAGEREF _Toc235719435 \h </w:instrText>
+          <w:instrText xml:space="preserve"> PAGEREF _Toc235720221 \h </w:instrText>
         </w:r>
         <w:r>
           <w:rPr>
@@ -3051,7 +3029,7 @@
       <w:r>
         <w:fldChar w:fldCharType="separate"/>
       </w:r>
-      <w:hyperlink w:anchor="_Toc235719436" w:history="1">
+      <w:hyperlink w:anchor="_Toc235720222" w:history="1">
         <w:r>
           <w:rPr>
             <w:rStyle w:val="Hyperlink"/>
@@ -3078,7 +3056,7 @@
             <w:noProof/>
             <w:webHidden/>
           </w:rPr>
-          <w:instrText xml:space="preserve"> PAGEREF _Toc235719436 \h </w:instrText>
+          <w:instrText xml:space="preserve"> PAGEREF _Toc235720222 \h </w:instrText>
         </w:r>
         <w:r>
           <w:rPr>
@@ -3125,7 +3103,7 @@
           <w14:ligatures w14:val="standardContextual"/>
         </w:rPr>
       </w:pPr>
-      <w:hyperlink w:anchor="_Toc235719437" w:history="1">
+      <w:hyperlink w:anchor="_Toc235720223" w:history="1">
         <w:r>
           <w:rPr>
             <w:rStyle w:val="Hyperlink"/>
@@ -3152,7 +3130,7 @@
             <w:noProof/>
             <w:webHidden/>
           </w:rPr>
-          <w:instrText xml:space="preserve"> PAGEREF _Toc235719437 \h </w:instrText>
+          <w:instrText xml:space="preserve"> PAGEREF _Toc235720223 \h </w:instrText>
         </w:r>
         <w:r>
           <w:rPr>
@@ -3199,7 +3177,7 @@
           <w14:ligatures w14:val="standardContextual"/>
         </w:rPr>
       </w:pPr>
-      <w:hyperlink w:anchor="_Toc235719438" w:history="1">
+      <w:hyperlink w:anchor="_Toc235720224" w:history="1">
         <w:r>
           <w:rPr>
             <w:rStyle w:val="Hyperlink"/>
@@ -3226,7 +3204,7 @@
             <w:noProof/>
             <w:webHidden/>
           </w:rPr>
-          <w:instrText xml:space="preserve"> PAGEREF _Toc235719438 \h </w:instrText>
+          <w:instrText xml:space="preserve"> PAGEREF _Toc235720224 \h </w:instrText>
         </w:r>
         <w:r>
           <w:rPr>
@@ -3273,7 +3251,7 @@
           <w14:ligatures w14:val="standardContextual"/>
         </w:rPr>
       </w:pPr>
-      <w:hyperlink w:anchor="_Toc235719439" w:history="1">
+      <w:hyperlink w:anchor="_Toc235720225" w:history="1">
         <w:r>
           <w:rPr>
             <w:rStyle w:val="Hyperlink"/>
@@ -3300,7 +3278,7 @@
             <w:noProof/>
             <w:webHidden/>
           </w:rPr>
-          <w:instrText xml:space="preserve"> PAGEREF _Toc235719439 \h </w:instrText>
+          <w:instrText xml:space="preserve"> PAGEREF _Toc235720225 \h </w:instrText>
         </w:r>
         <w:r>
           <w:rPr>
@@ -3347,7 +3325,7 @@
           <w14:ligatures w14:val="standardContextual"/>
         </w:rPr>
       </w:pPr>
-      <w:hyperlink w:anchor="_Toc235719440" w:history="1">
+      <w:hyperlink w:anchor="_Toc235720226" w:history="1">
         <w:r>
           <w:rPr>
             <w:rStyle w:val="Hyperlink"/>
@@ -3374,7 +3352,7 @@
             <w:noProof/>
             <w:webHidden/>
           </w:rPr>
-          <w:instrText xml:space="preserve"> PAGEREF _Toc235719440 \h </w:instrText>
+          <w:instrText xml:space="preserve"> PAGEREF _Toc235720226 \h </w:instrText>
         </w:r>
         <w:r>
           <w:rPr>
@@ -3421,7 +3399,7 @@
           <w14:ligatures w14:val="standardContextual"/>
         </w:rPr>
       </w:pPr>
-      <w:hyperlink w:anchor="_Toc235719441" w:history="1">
+      <w:hyperlink w:anchor="_Toc235720227" w:history="1">
         <w:r>
           <w:rPr>
             <w:rStyle w:val="Hyperlink"/>
@@ -3448,7 +3426,7 @@
             <w:noProof/>
             <w:webHidden/>
           </w:rPr>
-          <w:instrText xml:space="preserve"> PAGEREF _Toc235719441 \h </w:instrText>
+          <w:instrText xml:space="preserve"> PAGEREF _Toc235720227 \h </w:instrText>
         </w:r>
         <w:r>
           <w:rPr>
@@ -3495,7 +3473,7 @@
           <w14:ligatures w14:val="standardContextual"/>
         </w:rPr>
       </w:pPr>
-      <w:hyperlink w:anchor="_Toc235719442" w:history="1">
+      <w:hyperlink w:anchor="_Toc235720228" w:history="1">
         <w:r>
           <w:rPr>
             <w:rStyle w:val="Hyperlink"/>
@@ -3522,7 +3500,7 @@
             <w:noProof/>
             <w:webHidden/>
           </w:rPr>
-          <w:instrText xml:space="preserve"> PAGEREF _Toc235719442 \h </w:instrText>
+          <w:instrText xml:space="preserve"> PAGEREF _Toc235720228 \h </w:instrText>
         </w:r>
         <w:r>
           <w:rPr>
@@ -3569,7 +3547,7 @@
           <w14:ligatures w14:val="standardContextual"/>
         </w:rPr>
       </w:pPr>
-      <w:hyperlink w:anchor="_Toc235719443" w:history="1">
+      <w:hyperlink w:anchor="_Toc235720229" w:history="1">
         <w:r>
           <w:rPr>
             <w:rStyle w:val="Hyperlink"/>
@@ -3596,7 +3574,7 @@
             <w:noProof/>
             <w:webHidden/>
           </w:rPr>
-          <w:instrText xml:space="preserve"> PAGEREF _Toc235719443 \h </w:instrText>
+          <w:instrText xml:space="preserve"> PAGEREF _Toc235720229 \h </w:instrText>
         </w:r>
         <w:r>
           <w:rPr>
@@ -3643,7 +3621,7 @@
           <w14:ligatures w14:val="standardContextual"/>
         </w:rPr>
       </w:pPr>
-      <w:hyperlink w:anchor="_Toc235719444" w:history="1">
+      <w:hyperlink w:anchor="_Toc235720230" w:history="1">
         <w:r>
           <w:rPr>
             <w:rStyle w:val="Hyperlink"/>
@@ -3670,7 +3648,7 @@
             <w:noProof/>
             <w:webHidden/>
           </w:rPr>
-          <w:instrText xml:space="preserve"> PAGEREF _Toc235719444 \h </w:instrText>
+          <w:instrText xml:space="preserve"> PAGEREF _Toc235720230 \h </w:instrText>
         </w:r>
         <w:r>
           <w:rPr>
@@ -3717,7 +3695,7 @@
           <w14:ligatures w14:val="standardContextual"/>
         </w:rPr>
       </w:pPr>
-      <w:hyperlink w:anchor="_Toc235719445" w:history="1">
+      <w:hyperlink w:anchor="_Toc235720231" w:history="1">
         <w:r>
           <w:rPr>
             <w:rStyle w:val="Hyperlink"/>
@@ -3744,7 +3722,7 @@
             <w:noProof/>
             <w:webHidden/>
           </w:rPr>
-          <w:instrText xml:space="preserve"> PAGEREF _Toc235719445 \h </w:instrText>
+          <w:instrText xml:space="preserve"> PAGEREF _Toc235720231 \h </w:instrText>
         </w:r>
         <w:r>
           <w:rPr>
@@ -3791,7 +3769,7 @@
           <w14:ligatures w14:val="standardContextual"/>
         </w:rPr>
       </w:pPr>
-      <w:hyperlink w:anchor="_Toc235719446" w:history="1">
+      <w:hyperlink w:anchor="_Toc235720232" w:history="1">
         <w:r>
           <w:rPr>
             <w:rStyle w:val="Hyperlink"/>
@@ -3818,7 +3796,7 @@
             <w:noProof/>
             <w:webHidden/>
           </w:rPr>
-          <w:instrText xml:space="preserve"> PAGEREF _Toc235719446 \h </w:instrText>
+          <w:instrText xml:space="preserve"> PAGEREF _Toc235720232 \h </w:instrText>
         </w:r>
         <w:r>
           <w:rPr>
@@ -3892,7 +3870,7 @@
       <w:r>
         <w:fldChar w:fldCharType="separate"/>
       </w:r>
-      <w:hyperlink w:anchor="_Toc235719447" w:history="1">
+      <w:hyperlink w:anchor="_Toc235720233" w:history="1">
         <w:r>
           <w:rPr>
             <w:rStyle w:val="Hyperlink"/>
@@ -3919,7 +3897,7 @@
             <w:noProof/>
             <w:webHidden/>
           </w:rPr>
-          <w:instrText xml:space="preserve"> PAGEREF _Toc235719447 \h </w:instrText>
+          <w:instrText xml:space="preserve"> PAGEREF _Toc235720233 \h </w:instrText>
         </w:r>
         <w:r>
           <w:rPr>
@@ -3966,7 +3944,7 @@
           <w14:ligatures w14:val="standardContextual"/>
         </w:rPr>
       </w:pPr>
-      <w:hyperlink w:anchor="_Toc235719448" w:history="1">
+      <w:hyperlink w:anchor="_Toc235720234" w:history="1">
         <w:r>
           <w:rPr>
             <w:rStyle w:val="Hyperlink"/>
@@ -3993,7 +3971,7 @@
             <w:noProof/>
             <w:webHidden/>
           </w:rPr>
-          <w:instrText xml:space="preserve"> PAGEREF _Toc235719448 \h </w:instrText>
+          <w:instrText xml:space="preserve"> PAGEREF _Toc235720234 \h </w:instrText>
         </w:r>
         <w:r>
           <w:rPr>
@@ -4040,7 +4018,7 @@
           <w14:ligatures w14:val="standardContextual"/>
         </w:rPr>
       </w:pPr>
-      <w:hyperlink w:anchor="_Toc235719449" w:history="1">
+      <w:hyperlink w:anchor="_Toc235720235" w:history="1">
         <w:r>
           <w:rPr>
             <w:rStyle w:val="Hyperlink"/>
@@ -4067,7 +4045,7 @@
             <w:noProof/>
             <w:webHidden/>
           </w:rPr>
-          <w:instrText xml:space="preserve"> PAGEREF _Toc235719449 \h </w:instrText>
+          <w:instrText xml:space="preserve"> PAGEREF _Toc235720235 \h </w:instrText>
         </w:r>
         <w:r>
           <w:rPr>
@@ -4114,7 +4092,7 @@
           <w14:ligatures w14:val="standardContextual"/>
         </w:rPr>
       </w:pPr>
-      <w:hyperlink w:anchor="_Toc235719450" w:history="1">
+      <w:hyperlink w:anchor="_Toc235720236" w:history="1">
         <w:r>
           <w:rPr>
             <w:rStyle w:val="Hyperlink"/>
@@ -4141,7 +4119,7 @@
             <w:noProof/>
             <w:webHidden/>
           </w:rPr>
-          <w:instrText xml:space="preserve"> PAGEREF _Toc235719450 \h </w:instrText>
+          <w:instrText xml:space="preserve"> PAGEREF _Toc235720236 \h </w:instrText>
         </w:r>
         <w:r>
           <w:rPr>
@@ -4188,7 +4166,7 @@
           <w14:ligatures w14:val="standardContextual"/>
         </w:rPr>
       </w:pPr>
-      <w:hyperlink w:anchor="_Toc235719451" w:history="1">
+      <w:hyperlink w:anchor="_Toc235720237" w:history="1">
         <w:r>
           <w:rPr>
             <w:rStyle w:val="Hyperlink"/>
@@ -4215,7 +4193,7 @@
             <w:noProof/>
             <w:webHidden/>
           </w:rPr>
-          <w:instrText xml:space="preserve"> PAGEREF _Toc235719451 \h </w:instrText>
+          <w:instrText xml:space="preserve"> PAGEREF _Toc235720237 \h </w:instrText>
         </w:r>
         <w:r>
           <w:rPr>
@@ -4262,7 +4240,7 @@
           <w14:ligatures w14:val="standardContextual"/>
         </w:rPr>
       </w:pPr>
-      <w:hyperlink w:anchor="_Toc235719452" w:history="1">
+      <w:hyperlink w:anchor="_Toc235720238" w:history="1">
         <w:r>
           <w:rPr>
             <w:rStyle w:val="Hyperlink"/>
@@ -4289,7 +4267,7 @@
             <w:noProof/>
             <w:webHidden/>
           </w:rPr>
-          <w:instrText xml:space="preserve"> PAGEREF _Toc235719452 \h </w:instrText>
+          <w:instrText xml:space="preserve"> PAGEREF _Toc235720238 \h </w:instrText>
         </w:r>
         <w:r>
           <w:rPr>
@@ -4336,7 +4314,7 @@
           <w14:ligatures w14:val="standardContextual"/>
         </w:rPr>
       </w:pPr>
-      <w:hyperlink w:anchor="_Toc235719453" w:history="1">
+      <w:hyperlink w:anchor="_Toc235720239" w:history="1">
         <w:r>
           <w:rPr>
             <w:rStyle w:val="Hyperlink"/>
@@ -4363,7 +4341,7 @@
             <w:noProof/>
             <w:webHidden/>
           </w:rPr>
-          <w:instrText xml:space="preserve"> PAGEREF _Toc235719453 \h </w:instrText>
+          <w:instrText xml:space="preserve"> PAGEREF _Toc235720239 \h </w:instrText>
         </w:r>
         <w:r>
           <w:rPr>
@@ -4410,7 +4388,7 @@
           <w14:ligatures w14:val="standardContextual"/>
         </w:rPr>
       </w:pPr>
-      <w:hyperlink w:anchor="_Toc235719454" w:history="1">
+      <w:hyperlink w:anchor="_Toc235720240" w:history="1">
         <w:r>
           <w:rPr>
             <w:rStyle w:val="Hyperlink"/>
@@ -4437,7 +4415,7 @@
             <w:noProof/>
             <w:webHidden/>
           </w:rPr>
-          <w:instrText xml:space="preserve"> PAGEREF _Toc235719454 \h </w:instrText>
+          <w:instrText xml:space="preserve"> PAGEREF _Toc235720240 \h </w:instrText>
         </w:r>
         <w:r>
           <w:rPr>
@@ -4490,7 +4468,7 @@
       <w:pPr>
         <w:pStyle w:val="Heading1"/>
       </w:pPr>
-      <w:bookmarkStart w:id="0" w:name="_Toc235719399"/>
+      <w:bookmarkStart w:id="0" w:name="_Toc235720185"/>
       <w:r>
         <w:rPr>
           <w:rFonts w:ascii="Times New Roman" w:hAnsi="Times New Roman"/>
@@ -4504,7 +4482,7 @@
       <w:pPr>
         <w:pStyle w:val="Heading2"/>
       </w:pPr>
-      <w:bookmarkStart w:id="1" w:name="_Toc235719400"/>
+      <w:bookmarkStart w:id="1" w:name="_Toc235720186"/>
       <w:r>
         <w:rPr>
           <w:rFonts w:ascii="Times New Roman" w:hAnsi="Times New Roman"/>
@@ -4530,7 +4508,7 @@
       <w:pPr>
         <w:pStyle w:val="Heading2"/>
       </w:pPr>
-      <w:bookmarkStart w:id="2" w:name="_Toc235719401"/>
+      <w:bookmarkStart w:id="2" w:name="_Toc235720187"/>
       <w:r>
         <w:rPr>
           <w:rFonts w:ascii="Times New Roman" w:hAnsi="Times New Roman"/>
@@ -4548,7 +4526,7 @@
       <w:pPr>
         <w:pStyle w:val="Heading2"/>
       </w:pPr>
-      <w:bookmarkStart w:id="3" w:name="_Toc235719402"/>
+      <w:bookmarkStart w:id="3" w:name="_Toc235720188"/>
       <w:r>
         <w:rPr>
           <w:rFonts w:ascii="Times New Roman" w:hAnsi="Times New Roman"/>
@@ -4634,7 +4612,7 @@
       <w:pPr>
         <w:pStyle w:val="Heading2"/>
       </w:pPr>
-      <w:bookmarkStart w:id="4" w:name="_Toc235719403"/>
+      <w:bookmarkStart w:id="4" w:name="_Toc235720189"/>
       <w:r>
         <w:rPr>
           <w:rFonts w:ascii="Times New Roman" w:hAnsi="Times New Roman"/>
@@ -4655,7 +4633,7 @@
       <w:pPr>
         <w:pStyle w:val="Heading2"/>
       </w:pPr>
-      <w:bookmarkStart w:id="5" w:name="_Toc235719404"/>
+      <w:bookmarkStart w:id="5" w:name="_Toc235720190"/>
       <w:r>
         <w:rPr>
           <w:rFonts w:ascii="Times New Roman" w:hAnsi="Times New Roman"/>
@@ -4673,7 +4651,7 @@
       <w:pPr>
         <w:pStyle w:val="Heading1"/>
       </w:pPr>
-      <w:bookmarkStart w:id="6" w:name="_Toc235719405"/>
+      <w:bookmarkStart w:id="6" w:name="_Toc235720191"/>
       <w:r>
         <w:rPr>
           <w:rFonts w:ascii="Times New Roman" w:hAnsi="Times New Roman"/>
@@ -4687,7 +4665,7 @@
       <w:pPr>
         <w:pStyle w:val="Heading2"/>
       </w:pPr>
-      <w:bookmarkStart w:id="7" w:name="_Toc235719406"/>
+      <w:bookmarkStart w:id="7" w:name="_Toc235720192"/>
       <w:r>
         <w:rPr>
           <w:rFonts w:ascii="Times New Roman" w:hAnsi="Times New Roman"/>
@@ -4708,7 +4686,7 @@
       <w:pPr>
         <w:pStyle w:val="Heading2"/>
       </w:pPr>
-      <w:bookmarkStart w:id="8" w:name="_Toc235719407"/>
+      <w:bookmarkStart w:id="8" w:name="_Toc235720193"/>
       <w:r>
         <w:rPr>
           <w:rFonts w:ascii="Times New Roman" w:hAnsi="Times New Roman"/>
@@ -4734,7 +4712,7 @@
       <w:pPr>
         <w:pStyle w:val="Heading2"/>
       </w:pPr>
-      <w:bookmarkStart w:id="9" w:name="_Toc235719408"/>
+      <w:bookmarkStart w:id="9" w:name="_Toc235720194"/>
       <w:r>
         <w:rPr>
           <w:rFonts w:ascii="Times New Roman" w:hAnsi="Times New Roman"/>
@@ -4756,7 +4734,7 @@
       <w:pPr>
         <w:pStyle w:val="Heading2"/>
       </w:pPr>
-      <w:bookmarkStart w:id="10" w:name="_Toc235719409"/>
+      <w:bookmarkStart w:id="10" w:name="_Toc235720195"/>
       <w:r>
         <w:rPr>
           <w:rFonts w:ascii="Times New Roman" w:hAnsi="Times New Roman"/>
@@ -4774,7 +4752,7 @@
       <w:pPr>
         <w:pStyle w:val="Heading1"/>
       </w:pPr>
-      <w:bookmarkStart w:id="11" w:name="_Toc235719410"/>
+      <w:bookmarkStart w:id="11" w:name="_Toc235720196"/>
       <w:r>
         <w:rPr>
           <w:rFonts w:ascii="Times New Roman" w:hAnsi="Times New Roman"/>
@@ -4788,7 +4766,7 @@
       <w:pPr>
         <w:pStyle w:val="Heading2"/>
       </w:pPr>
-      <w:bookmarkStart w:id="12" w:name="_Toc235719411"/>
+      <w:bookmarkStart w:id="12" w:name="_Toc235720197"/>
       <w:r>
         <w:rPr>
           <w:rFonts w:ascii="Times New Roman" w:hAnsi="Times New Roman"/>
@@ -4809,7 +4787,7 @@
       <w:pPr>
         <w:pStyle w:val="Heading2"/>
       </w:pPr>
-      <w:bookmarkStart w:id="13" w:name="_Toc235719412"/>
+      <w:bookmarkStart w:id="13" w:name="_Toc235720198"/>
       <w:r>
         <w:rPr>
           <w:rFonts w:ascii="Times New Roman" w:hAnsi="Times New Roman"/>
@@ -4828,7 +4806,7 @@
         <w:pStyle w:val="Caption"/>
         <w:jc w:val="center"/>
       </w:pPr>
-      <w:bookmarkStart w:id="14" w:name="_Toc235719447"/>
+      <w:bookmarkStart w:id="14" w:name="_Toc235720233"/>
       <w:r>
         <w:t xml:space="preserve">Table </w:t>
       </w:r>
@@ -5412,7 +5390,7 @@
       <w:pPr>
         <w:pStyle w:val="Heading2"/>
       </w:pPr>
-      <w:bookmarkStart w:id="15" w:name="_Toc235719413"/>
+      <w:bookmarkStart w:id="15" w:name="_Toc235720199"/>
       <w:r>
         <w:rPr>
           <w:rFonts w:ascii="Times New Roman" w:hAnsi="Times New Roman"/>
@@ -5431,7 +5409,7 @@
         <w:pStyle w:val="Caption"/>
         <w:jc w:val="center"/>
       </w:pPr>
-      <w:bookmarkStart w:id="16" w:name="_Toc235719448"/>
+      <w:bookmarkStart w:id="16" w:name="_Toc235720234"/>
       <w:r>
         <w:t xml:space="preserve">Table </w:t>
       </w:r>
@@ -5750,7 +5728,7 @@
       <w:pPr>
         <w:pStyle w:val="Heading2"/>
       </w:pPr>
-      <w:bookmarkStart w:id="17" w:name="_Toc235719414"/>
+      <w:bookmarkStart w:id="17" w:name="_Toc235720200"/>
       <w:r>
         <w:rPr>
           <w:rFonts w:ascii="Times New Roman" w:hAnsi="Times New Roman"/>
@@ -5768,7 +5746,7 @@
       <w:pPr>
         <w:pStyle w:val="Heading2"/>
       </w:pPr>
-      <w:bookmarkStart w:id="18" w:name="_Toc235719415"/>
+      <w:bookmarkStart w:id="18" w:name="_Toc235720201"/>
       <w:r>
         <w:rPr>
           <w:rFonts w:ascii="Times New Roman" w:hAnsi="Times New Roman"/>
@@ -5782,7 +5760,7 @@
         <w:pStyle w:val="Caption"/>
         <w:jc w:val="center"/>
       </w:pPr>
-      <w:bookmarkStart w:id="19" w:name="_Toc235719449"/>
+      <w:bookmarkStart w:id="19" w:name="_Toc235720235"/>
       <w:r>
         <w:t xml:space="preserve">Table </w:t>
       </w:r>
@@ -6107,7 +6085,7 @@
       <w:pPr>
         <w:pStyle w:val="Heading2"/>
       </w:pPr>
-      <w:bookmarkStart w:id="20" w:name="_Toc235719416"/>
+      <w:bookmarkStart w:id="20" w:name="_Toc235720202"/>
       <w:r>
         <w:rPr>
           <w:rFonts w:ascii="Times New Roman" w:hAnsi="Times New Roman"/>
@@ -6125,7 +6103,7 @@
       <w:pPr>
         <w:pStyle w:val="Heading1"/>
       </w:pPr>
-      <w:bookmarkStart w:id="21" w:name="_Toc235719417"/>
+      <w:bookmarkStart w:id="21" w:name="_Toc235720203"/>
       <w:r>
         <w:rPr>
           <w:rFonts w:ascii="Times New Roman" w:hAnsi="Times New Roman"/>
@@ -6139,7 +6117,7 @@
       <w:pPr>
         <w:pStyle w:val="Heading2"/>
       </w:pPr>
-      <w:bookmarkStart w:id="22" w:name="_Toc235719418"/>
+      <w:bookmarkStart w:id="22" w:name="_Toc235720204"/>
       <w:r>
         <w:rPr>
           <w:rFonts w:ascii="Times New Roman" w:hAnsi="Times New Roman"/>
@@ -6157,7 +6135,7 @@
           <w:noProof/>
         </w:rPr>
         <w:drawing>
-          <wp:inline distT="0" distB="0" distL="0" distR="0" wp14:anchorId="20483D03" wp14:editId="0E595616">
+          <wp:inline distT="0" distB="0" distL="0" distR="0" wp14:anchorId="42E2B3BB" wp14:editId="0E15EBA5">
             <wp:extent cx="3474720" cy="2779776"/>
             <wp:effectExtent l="0" t="0" r="0" b="0"/>
             <wp:docPr id="1" name="Picture 1"/>
@@ -6198,7 +6176,7 @@
         <w:pStyle w:val="Caption"/>
         <w:jc w:val="center"/>
       </w:pPr>
-      <w:bookmarkStart w:id="23" w:name="_Toc235719436"/>
+      <w:bookmarkStart w:id="23" w:name="_Toc235720222"/>
       <w:r>
         <w:t xml:space="preserve">Figure </w:t>
       </w:r>
@@ -6234,7 +6212,7 @@
           <w:noProof/>
         </w:rPr>
         <w:drawing>
-          <wp:inline distT="0" distB="0" distL="0" distR="0" wp14:anchorId="14485419" wp14:editId="35CF0F36">
+          <wp:inline distT="0" distB="0" distL="0" distR="0" wp14:anchorId="79FDE331" wp14:editId="1C01CF3B">
             <wp:extent cx="5394960" cy="1541417"/>
             <wp:effectExtent l="0" t="0" r="0" b="0"/>
             <wp:docPr id="2" name="Picture 2"/>
@@ -6275,7 +6253,7 @@
         <w:pStyle w:val="Caption"/>
         <w:jc w:val="center"/>
       </w:pPr>
-      <w:bookmarkStart w:id="24" w:name="_Toc235719437"/>
+      <w:bookmarkStart w:id="24" w:name="_Toc235720223"/>
       <w:r>
         <w:t xml:space="preserve">Figure </w:t>
       </w:r>
@@ -6311,7 +6289,7 @@
       <w:pPr>
         <w:pStyle w:val="Heading2"/>
       </w:pPr>
-      <w:bookmarkStart w:id="25" w:name="_Toc235719419"/>
+      <w:bookmarkStart w:id="25" w:name="_Toc235720205"/>
       <w:r>
         <w:rPr>
           <w:rFonts w:ascii="Times New Roman" w:hAnsi="Times New Roman"/>
@@ -6330,7 +6308,7 @@
           <w:noProof/>
         </w:rPr>
         <w:drawing>
-          <wp:inline distT="0" distB="0" distL="0" distR="0" wp14:anchorId="63875312" wp14:editId="598ACC2E">
+          <wp:inline distT="0" distB="0" distL="0" distR="0" wp14:anchorId="0C77CACD" wp14:editId="6AABCF12">
             <wp:extent cx="5394960" cy="2877312"/>
             <wp:effectExtent l="0" t="0" r="0" b="0"/>
             <wp:docPr id="3" name="Picture 3"/>
@@ -6371,7 +6349,7 @@
         <w:pStyle w:val="Caption"/>
         <w:jc w:val="center"/>
       </w:pPr>
-      <w:bookmarkStart w:id="26" w:name="_Toc235719438"/>
+      <w:bookmarkStart w:id="26" w:name="_Toc235720224"/>
       <w:r>
         <w:t xml:space="preserve">Figure </w:t>
       </w:r>
@@ -6407,7 +6385,7 @@
       <w:pPr>
         <w:pStyle w:val="Heading2"/>
       </w:pPr>
-      <w:bookmarkStart w:id="27" w:name="_Toc235719420"/>
+      <w:bookmarkStart w:id="27" w:name="_Toc235720206"/>
       <w:r>
         <w:rPr>
           <w:rFonts w:ascii="Times New Roman" w:hAnsi="Times New Roman"/>
@@ -6426,7 +6404,7 @@
           <w:noProof/>
         </w:rPr>
         <w:drawing>
-          <wp:inline distT="0" distB="0" distL="0" distR="0" wp14:anchorId="3CC7D71B" wp14:editId="5993EAD8">
+          <wp:inline distT="0" distB="0" distL="0" distR="0" wp14:anchorId="5C33D302" wp14:editId="4B32DC07">
             <wp:extent cx="5394960" cy="4495800"/>
             <wp:effectExtent l="0" t="0" r="0" b="0"/>
             <wp:docPr id="4" name="Picture 4"/>
@@ -6467,7 +6445,7 @@
         <w:pStyle w:val="Caption"/>
         <w:jc w:val="center"/>
       </w:pPr>
-      <w:bookmarkStart w:id="28" w:name="_Toc235719439"/>
+      <w:bookmarkStart w:id="28" w:name="_Toc235720225"/>
       <w:r>
         <w:t xml:space="preserve">Figure </w:t>
       </w:r>
@@ -6503,7 +6481,7 @@
           <w:noProof/>
         </w:rPr>
         <w:drawing>
-          <wp:inline distT="0" distB="0" distL="0" distR="0" wp14:anchorId="1AA5379D" wp14:editId="4F533F07">
+          <wp:inline distT="0" distB="0" distL="0" distR="0" wp14:anchorId="792FCC62" wp14:editId="39C0D59F">
             <wp:extent cx="4572000" cy="2857500"/>
             <wp:effectExtent l="0" t="0" r="0" b="0"/>
             <wp:docPr id="5" name="Picture 5"/>
@@ -6544,7 +6522,7 @@
         <w:pStyle w:val="Caption"/>
         <w:jc w:val="center"/>
       </w:pPr>
-      <w:bookmarkStart w:id="29" w:name="_Toc235719440"/>
+      <w:bookmarkStart w:id="29" w:name="_Toc235720226"/>
       <w:r>
         <w:t xml:space="preserve">Figure </w:t>
       </w:r>
@@ -6582,7 +6560,7 @@
         <w:pStyle w:val="Caption"/>
         <w:jc w:val="center"/>
       </w:pPr>
-      <w:bookmarkStart w:id="30" w:name="_Toc235719450"/>
+      <w:bookmarkStart w:id="30" w:name="_Toc235720236"/>
       <w:r>
         <w:t xml:space="preserve">Table </w:t>
       </w:r>
@@ -7077,7 +7055,7 @@
       <w:pPr>
         <w:pStyle w:val="Heading1"/>
       </w:pPr>
-      <w:bookmarkStart w:id="31" w:name="_Toc235719421"/>
+      <w:bookmarkStart w:id="31" w:name="_Toc235720207"/>
       <w:r>
         <w:rPr>
           <w:rFonts w:ascii="Times New Roman" w:hAnsi="Times New Roman"/>
@@ -7091,7 +7069,7 @@
       <w:pPr>
         <w:pStyle w:val="Heading2"/>
       </w:pPr>
-      <w:bookmarkStart w:id="32" w:name="_Toc235719422"/>
+      <w:bookmarkStart w:id="32" w:name="_Toc235720208"/>
       <w:r>
         <w:rPr>
           <w:rFonts w:ascii="Times New Roman" w:hAnsi="Times New Roman"/>
@@ -7105,7 +7083,7 @@
         <w:pStyle w:val="Caption"/>
         <w:jc w:val="center"/>
       </w:pPr>
-      <w:bookmarkStart w:id="33" w:name="_Toc235719451"/>
+      <w:bookmarkStart w:id="33" w:name="_Toc235720237"/>
       <w:r>
         <w:t xml:space="preserve">Table </w:t>
       </w:r>
@@ -7945,7 +7923,7 @@
           <w:noProof/>
         </w:rPr>
         <w:drawing>
-          <wp:inline distT="0" distB="0" distL="0" distR="0" wp14:anchorId="47A5C3D6" wp14:editId="3D56CFD8">
+          <wp:inline distT="0" distB="0" distL="0" distR="0" wp14:anchorId="35CFFEB8" wp14:editId="076B970A">
             <wp:extent cx="5394960" cy="2074985"/>
             <wp:effectExtent l="0" t="0" r="0" b="0"/>
             <wp:docPr id="6" name="Picture 6"/>
@@ -7986,7 +7964,7 @@
         <w:pStyle w:val="Caption"/>
         <w:jc w:val="center"/>
       </w:pPr>
-      <w:bookmarkStart w:id="34" w:name="_Toc235719441"/>
+      <w:bookmarkStart w:id="34" w:name="_Toc235720227"/>
       <w:r>
         <w:t xml:space="preserve">Figure </w:t>
       </w:r>
@@ -8026,7 +8004,7 @@
       <w:pPr>
         <w:pStyle w:val="Heading2"/>
       </w:pPr>
-      <w:bookmarkStart w:id="35" w:name="_Toc235719423"/>
+      <w:bookmarkStart w:id="35" w:name="_Toc235720209"/>
       <w:r>
         <w:rPr>
           <w:rFonts w:ascii="Times New Roman" w:hAnsi="Times New Roman"/>
@@ -8044,7 +8022,7 @@
           <w:noProof/>
         </w:rPr>
         <w:drawing>
-          <wp:inline distT="0" distB="0" distL="0" distR="0" wp14:anchorId="467068E9" wp14:editId="61758B82">
+          <wp:inline distT="0" distB="0" distL="0" distR="0" wp14:anchorId="458E04F8" wp14:editId="7461699E">
             <wp:extent cx="3657600" cy="2926080"/>
             <wp:effectExtent l="0" t="0" r="0" b="0"/>
             <wp:docPr id="7" name="Picture 7"/>
@@ -8085,7 +8063,7 @@
         <w:pStyle w:val="Caption"/>
         <w:jc w:val="center"/>
       </w:pPr>
-      <w:bookmarkStart w:id="36" w:name="_Toc235719442"/>
+      <w:bookmarkStart w:id="36" w:name="_Toc235720228"/>
       <w:r>
         <w:t xml:space="preserve">Figure </w:t>
       </w:r>
@@ -8124,7 +8102,7 @@
       <w:pPr>
         <w:pStyle w:val="Heading1"/>
       </w:pPr>
-      <w:bookmarkStart w:id="37" w:name="_Toc235719424"/>
+      <w:bookmarkStart w:id="37" w:name="_Toc235720210"/>
       <w:r>
         <w:rPr>
           <w:rFonts w:ascii="Times New Roman" w:hAnsi="Times New Roman"/>
@@ -8138,7 +8116,7 @@
       <w:pPr>
         <w:pStyle w:val="Heading2"/>
       </w:pPr>
-      <w:bookmarkStart w:id="38" w:name="_Toc235719425"/>
+      <w:bookmarkStart w:id="38" w:name="_Toc235720211"/>
       <w:r>
         <w:rPr>
           <w:rFonts w:ascii="Times New Roman" w:hAnsi="Times New Roman"/>
@@ -8156,7 +8134,7 @@
           <w:noProof/>
         </w:rPr>
         <w:drawing>
-          <wp:inline distT="0" distB="0" distL="0" distR="0" wp14:anchorId="7575E466" wp14:editId="46C805A8">
+          <wp:inline distT="0" distB="0" distL="0" distR="0" wp14:anchorId="581DD632" wp14:editId="0BAF297D">
             <wp:extent cx="5394960" cy="4046220"/>
             <wp:effectExtent l="0" t="0" r="0" b="0"/>
             <wp:docPr id="8" name="Picture 8"/>
@@ -8197,7 +8175,7 @@
         <w:pStyle w:val="Caption"/>
         <w:jc w:val="center"/>
       </w:pPr>
-      <w:bookmarkStart w:id="39" w:name="_Toc235719443"/>
+      <w:bookmarkStart w:id="39" w:name="_Toc235720229"/>
       <w:r>
         <w:t xml:space="preserve">Figure </w:t>
       </w:r>
@@ -8229,7 +8207,7 @@
         <w:pStyle w:val="Caption"/>
         <w:jc w:val="center"/>
       </w:pPr>
-      <w:bookmarkStart w:id="40" w:name="_Toc235719452"/>
+      <w:bookmarkStart w:id="40" w:name="_Toc235720238"/>
       <w:r>
         <w:t xml:space="preserve">Table </w:t>
       </w:r>
@@ -8681,7 +8659,7 @@
       <w:pPr>
         <w:pStyle w:val="Heading2"/>
       </w:pPr>
-      <w:bookmarkStart w:id="41" w:name="_Toc235719426"/>
+      <w:bookmarkStart w:id="41" w:name="_Toc235720212"/>
       <w:r>
         <w:rPr>
           <w:rFonts w:ascii="Times New Roman" w:hAnsi="Times New Roman"/>
@@ -8699,7 +8677,7 @@
           <w:noProof/>
         </w:rPr>
         <w:drawing>
-          <wp:inline distT="0" distB="0" distL="0" distR="0" wp14:anchorId="028DC764" wp14:editId="1426F423">
+          <wp:inline distT="0" distB="0" distL="0" distR="0" wp14:anchorId="59D75469" wp14:editId="34CE1C3B">
             <wp:extent cx="4754880" cy="4457700"/>
             <wp:effectExtent l="0" t="0" r="0" b="0"/>
             <wp:docPr id="9" name="Picture 9"/>
@@ -8740,7 +8718,7 @@
         <w:pStyle w:val="Caption"/>
         <w:jc w:val="center"/>
       </w:pPr>
-      <w:bookmarkStart w:id="42" w:name="_Toc235719444"/>
+      <w:bookmarkStart w:id="42" w:name="_Toc235720230"/>
       <w:r>
         <w:t xml:space="preserve">Figure </w:t>
       </w:r>
@@ -8777,7 +8755,7 @@
         </w:rPr>
         <w:lastRenderedPageBreak/>
         <w:drawing>
-          <wp:inline distT="0" distB="0" distL="0" distR="0" wp14:anchorId="3570AE05" wp14:editId="3ED0D55A">
+          <wp:inline distT="0" distB="0" distL="0" distR="0" wp14:anchorId="621DE656" wp14:editId="301A6874">
             <wp:extent cx="4572000" cy="4286250"/>
             <wp:effectExtent l="0" t="0" r="0" b="0"/>
             <wp:docPr id="10" name="Picture 10"/>
@@ -8818,7 +8796,7 @@
         <w:pStyle w:val="Caption"/>
         <w:jc w:val="center"/>
       </w:pPr>
-      <w:bookmarkStart w:id="43" w:name="_Toc235719445"/>
+      <w:bookmarkStart w:id="43" w:name="_Toc235720231"/>
       <w:r>
         <w:t xml:space="preserve">Figure </w:t>
       </w:r>
@@ -8854,7 +8832,7 @@
       <w:pPr>
         <w:pStyle w:val="Heading2"/>
       </w:pPr>
-      <w:bookmarkStart w:id="44" w:name="_Toc235719427"/>
+      <w:bookmarkStart w:id="44" w:name="_Toc235720213"/>
       <w:r>
         <w:rPr>
           <w:rFonts w:ascii="Times New Roman" w:hAnsi="Times New Roman"/>
@@ -8873,7 +8851,7 @@
           <w:noProof/>
         </w:rPr>
         <w:drawing>
-          <wp:inline distT="0" distB="0" distL="0" distR="0" wp14:anchorId="6C95A7DF" wp14:editId="44560F78">
+          <wp:inline distT="0" distB="0" distL="0" distR="0" wp14:anchorId="0026039C" wp14:editId="4D652680">
             <wp:extent cx="5394960" cy="3082834"/>
             <wp:effectExtent l="0" t="0" r="0" b="0"/>
             <wp:docPr id="11" name="Picture 11"/>
@@ -8914,7 +8892,7 @@
         <w:pStyle w:val="Caption"/>
         <w:jc w:val="center"/>
       </w:pPr>
-      <w:bookmarkStart w:id="45" w:name="_Toc235719446"/>
+      <w:bookmarkStart w:id="45" w:name="_Toc235720232"/>
       <w:r>
         <w:t xml:space="preserve">Figure </w:t>
       </w:r>
@@ -8950,7 +8928,7 @@
       <w:pPr>
         <w:pStyle w:val="Heading1"/>
       </w:pPr>
-      <w:bookmarkStart w:id="46" w:name="_Toc235719428"/>
+      <w:bookmarkStart w:id="46" w:name="_Toc235720214"/>
       <w:r>
         <w:rPr>
           <w:rFonts w:ascii="Times New Roman" w:hAnsi="Times New Roman"/>
@@ -8964,7 +8942,7 @@
       <w:pPr>
         <w:pStyle w:val="Heading2"/>
       </w:pPr>
-      <w:bookmarkStart w:id="47" w:name="_Toc235719429"/>
+      <w:bookmarkStart w:id="47" w:name="_Toc235720215"/>
       <w:r>
         <w:rPr>
           <w:rFonts w:ascii="Times New Roman" w:hAnsi="Times New Roman"/>
@@ -9022,7 +9000,7 @@
       <w:pPr>
         <w:pStyle w:val="Heading2"/>
       </w:pPr>
-      <w:bookmarkStart w:id="48" w:name="_Toc235719430"/>
+      <w:bookmarkStart w:id="48" w:name="_Toc235720216"/>
       <w:r>
         <w:rPr>
           <w:rFonts w:ascii="Times New Roman" w:hAnsi="Times New Roman"/>
@@ -9036,7 +9014,7 @@
         <w:pStyle w:val="Caption"/>
         <w:jc w:val="center"/>
       </w:pPr>
-      <w:bookmarkStart w:id="49" w:name="_Toc235719453"/>
+      <w:bookmarkStart w:id="49" w:name="_Toc235720239"/>
       <w:r>
         <w:t xml:space="preserve">Table </w:t>
       </w:r>
@@ -9407,7 +9385,7 @@
       <w:pPr>
         <w:pStyle w:val="Heading1"/>
       </w:pPr>
-      <w:bookmarkStart w:id="50" w:name="_Toc235719431"/>
+      <w:bookmarkStart w:id="50" w:name="_Toc235720217"/>
       <w:r>
         <w:rPr>
           <w:rFonts w:ascii="Times New Roman" w:hAnsi="Times New Roman"/>
@@ -9466,7 +9444,7 @@
       <w:pPr>
         <w:pStyle w:val="Heading1"/>
       </w:pPr>
-      <w:bookmarkStart w:id="51" w:name="_Toc235719432"/>
+      <w:bookmarkStart w:id="51" w:name="_Toc235720218"/>
       <w:r>
         <w:rPr>
           <w:rFonts w:ascii="Times New Roman" w:hAnsi="Times New Roman"/>
@@ -9488,7 +9466,7 @@
       <w:pPr>
         <w:pStyle w:val="Heading1"/>
       </w:pPr>
-      <w:bookmarkStart w:id="52" w:name="_Toc235719433"/>
+      <w:bookmarkStart w:id="52" w:name="_Toc235720219"/>
       <w:r>
         <w:rPr>
           <w:rFonts w:ascii="Times New Roman" w:hAnsi="Times New Roman"/>
@@ -9582,7 +9560,7 @@
       <w:pPr>
         <w:pStyle w:val="Heading1"/>
       </w:pPr>
-      <w:bookmarkStart w:id="53" w:name="_Toc235719434"/>
+      <w:bookmarkStart w:id="53" w:name="_Toc235720220"/>
       <w:r>
         <w:rPr>
           <w:rFonts w:ascii="Times New Roman" w:hAnsi="Times New Roman"/>
@@ -9646,7 +9624,7 @@
       <w:pPr>
         <w:pStyle w:val="Heading1"/>
       </w:pPr>
-      <w:bookmarkStart w:id="54" w:name="_Toc235719435"/>
+      <w:bookmarkStart w:id="54" w:name="_Toc235720221"/>
       <w:r>
         <w:rPr>
           <w:rFonts w:ascii="Times New Roman" w:hAnsi="Times New Roman"/>
@@ -9661,7 +9639,7 @@
         <w:pStyle w:val="Caption"/>
         <w:jc w:val="center"/>
       </w:pPr>
-      <w:bookmarkStart w:id="55" w:name="_Toc235719454"/>
+      <w:bookmarkStart w:id="55" w:name="_Toc235720240"/>
       <w:r>
         <w:t xml:space="preserve">Table </w:t>
       </w:r>
@@ -10280,31 +10258,31 @@
       </w:rPr>
     </w:lvl>
   </w:abstractNum>
-  <w:num w:numId="1" w16cid:durableId="1661497976">
+  <w:num w:numId="1" w16cid:durableId="751898713">
     <w:abstractNumId w:val="8"/>
   </w:num>
-  <w:num w:numId="2" w16cid:durableId="1752190890">
+  <w:num w:numId="2" w16cid:durableId="665472806">
     <w:abstractNumId w:val="6"/>
   </w:num>
-  <w:num w:numId="3" w16cid:durableId="1844781735">
+  <w:num w:numId="3" w16cid:durableId="1286353215">
     <w:abstractNumId w:val="5"/>
   </w:num>
-  <w:num w:numId="4" w16cid:durableId="262032987">
+  <w:num w:numId="4" w16cid:durableId="839392005">
     <w:abstractNumId w:val="4"/>
   </w:num>
-  <w:num w:numId="5" w16cid:durableId="1855879607">
+  <w:num w:numId="5" w16cid:durableId="2061853600">
     <w:abstractNumId w:val="7"/>
   </w:num>
-  <w:num w:numId="6" w16cid:durableId="410004688">
+  <w:num w:numId="6" w16cid:durableId="863444871">
     <w:abstractNumId w:val="3"/>
   </w:num>
-  <w:num w:numId="7" w16cid:durableId="1596548602">
+  <w:num w:numId="7" w16cid:durableId="451942083">
     <w:abstractNumId w:val="2"/>
   </w:num>
-  <w:num w:numId="8" w16cid:durableId="2024165931">
+  <w:num w:numId="8" w16cid:durableId="429277226">
     <w:abstractNumId w:val="1"/>
   </w:num>
-  <w:num w:numId="9" w16cid:durableId="1648628877">
+  <w:num w:numId="9" w16cid:durableId="1612204427">
     <w:abstractNumId w:val="0"/>
   </w:num>
 </w:numbering>
@@ -21708,7 +21686,7 @@
     <w:autoRedefine/>
     <w:uiPriority w:val="39"/>
     <w:unhideWhenUsed/>
-    <w:rsid w:val="0020319D"/>
+    <w:rsid w:val="00243B7E"/>
     <w:pPr>
       <w:spacing w:after="100"/>
     </w:pPr>
@@ -21720,7 +21698,7 @@
     <w:autoRedefine/>
     <w:uiPriority w:val="39"/>
     <w:unhideWhenUsed/>
-    <w:rsid w:val="0020319D"/>
+    <w:rsid w:val="00243B7E"/>
     <w:pPr>
       <w:spacing w:after="100"/>
       <w:ind w:left="240"/>
@@ -21731,7 +21709,7 @@
     <w:basedOn w:val="DefaultParagraphFont"/>
     <w:uiPriority w:val="99"/>
     <w:unhideWhenUsed/>
-    <w:rsid w:val="0020319D"/>
+    <w:rsid w:val="00243B7E"/>
     <w:rPr>
       <w:color w:val="0000FF" w:themeColor="hyperlink"/>
       <w:u w:val="single"/>
@@ -21743,7 +21721,7 @@
     <w:next w:val="Normal"/>
     <w:uiPriority w:val="99"/>
     <w:unhideWhenUsed/>
-    <w:rsid w:val="0020319D"/>
+    <w:rsid w:val="00243B7E"/>
     <w:pPr>
       <w:spacing w:after="0"/>
     </w:pPr>

</xml_diff>

<commit_message>
Remove all Unified Mentor and internship references from research paper
</commit_message>
<xml_diff>
--- a/reports/research_paper.docx
+++ b/reports/research_paper.docx
@@ -46,15 +46,6 @@
     </w:p>
     <w:p>
       <w:pPr>
-        <w:spacing w:after="0"/>
-        <w:jc w:val="center"/>
-      </w:pPr>
-      <w:r>
-        <w:t>A Research Paper submitted in partial fulfilment of the requirements of the</w:t>
-      </w:r>
-    </w:p>
-    <w:p>
-      <w:pPr>
         <w:spacing w:after="600"/>
         <w:jc w:val="center"/>
       </w:pPr>
@@ -62,7 +53,7 @@
         <w:rPr>
           <w:b/>
         </w:rPr>
-        <w:t>Data Science Internship Program</w:t>
+        <w:t>A Research Paper</w:t>
       </w:r>
     </w:p>
     <w:p>
@@ -116,10 +107,7 @@
     </w:p>
     <w:p>
       <w:r>
-        <w:t>I hereby declare that this research paper, “Predictive Modeling and Risk Scoring for Bank Customer Churn,” is my own original work, carried out as part of the Data Science Internship Program under the mentorship of Unified Mentor. All data analysis, model development, and interpretation presented herein were performed by me. Wherever the work of other authors has been used, it has been duly acknowledged and cited in accordance with APA (7th edition) referencing conventions. This paper has not been submitted</w:t>
-      </w:r>
-      <w:r>
-        <w:t>, in whole or in part, for any other degree, diploma, or certification.</w:t>
+        <w:t>I hereby declare that this research paper, “Predictive Modeling and Risk Scoring for Bank Customer Churn,” is my own original work. All data analysis, model development, and interpretation presented herein were performed by me. Wherever the work of other authors has been used, it has been duly acknowledged and cited in accordance with APA (7th edition) referencing conventions. This paper has not been submitted, in whole or in part, for any other degree, diploma, or certification.</w:t>
       </w:r>
     </w:p>
     <w:p/>
@@ -166,10 +154,7 @@
     </w:p>
     <w:p>
       <w:r>
-        <w:t>I express my sincere gratitude to Unified Mentor for the structured guidance, the problem framing, and the opportunity to work on an industry-relevant analytics engagement. I am equally thankful to the open-source community behind Python, scikit-learn, XGBoost, SHAP, and Streamlit, whose tools made an end-to-end delivery — from raw data to a deployed decision-support dashboard — achievable within the internship timeline. Finally, I thank my peers and reviewers whose critical feedback materially improved the</w:t>
-      </w:r>
-      <w:r>
-        <w:t xml:space="preserve"> rigor and clarity of this paper.</w:t>
+        <w:t>I am thankful to the open-source community behind Python, scikit-learn, XGBoost, SHAP, and Streamlit, whose tools made an end-to-end delivery — from raw data to a deployed decision-support dashboard — achievable within the project timeline. I also thank my peers and reviewers whose critical feedback materially improved the rigor and clarity of this paper.</w:t>
       </w:r>
     </w:p>
     <w:p>
@@ -258,7 +243,7 @@
       <w:r>
         <w:fldChar w:fldCharType="separate"/>
       </w:r>
-      <w:hyperlink w:anchor="_Toc235720185" w:history="1">
+      <w:hyperlink w:anchor="_Toc235720276" w:history="1">
         <w:r>
           <w:rPr>
             <w:rStyle w:val="Hyperlink"/>
@@ -285,7 +270,7 @@
             <w:noProof/>
             <w:webHidden/>
           </w:rPr>
-          <w:instrText xml:space="preserve"> PAGEREF _Toc235720185 \h </w:instrText>
+          <w:instrText xml:space="preserve"> PAGEREF _Toc235720276 \h </w:instrText>
         </w:r>
         <w:r>
           <w:rPr>
@@ -332,7 +317,7 @@
           <w14:ligatures w14:val="standardContextual"/>
         </w:rPr>
       </w:pPr>
-      <w:hyperlink w:anchor="_Toc235720186" w:history="1">
+      <w:hyperlink w:anchor="_Toc235720277" w:history="1">
         <w:r>
           <w:rPr>
             <w:rStyle w:val="Hyperlink"/>
@@ -359,7 +344,7 @@
             <w:noProof/>
             <w:webHidden/>
           </w:rPr>
-          <w:instrText xml:space="preserve"> PAGEREF _Toc235720186 \h </w:instrText>
+          <w:instrText xml:space="preserve"> PAGEREF _Toc235720277 \h </w:instrText>
         </w:r>
         <w:r>
           <w:rPr>
@@ -406,7 +391,7 @@
           <w14:ligatures w14:val="standardContextual"/>
         </w:rPr>
       </w:pPr>
-      <w:hyperlink w:anchor="_Toc235720187" w:history="1">
+      <w:hyperlink w:anchor="_Toc235720278" w:history="1">
         <w:r>
           <w:rPr>
             <w:rStyle w:val="Hyperlink"/>
@@ -433,7 +418,7 @@
             <w:noProof/>
             <w:webHidden/>
           </w:rPr>
-          <w:instrText xml:space="preserve"> PAGEREF _Toc235720187 \h </w:instrText>
+          <w:instrText xml:space="preserve"> PAGEREF _Toc235720278 \h </w:instrText>
         </w:r>
         <w:r>
           <w:rPr>
@@ -480,7 +465,7 @@
           <w14:ligatures w14:val="standardContextual"/>
         </w:rPr>
       </w:pPr>
-      <w:hyperlink w:anchor="_Toc235720188" w:history="1">
+      <w:hyperlink w:anchor="_Toc235720279" w:history="1">
         <w:r>
           <w:rPr>
             <w:rStyle w:val="Hyperlink"/>
@@ -507,7 +492,7 @@
             <w:noProof/>
             <w:webHidden/>
           </w:rPr>
-          <w:instrText xml:space="preserve"> PAGEREF _Toc235720188 \h </w:instrText>
+          <w:instrText xml:space="preserve"> PAGEREF _Toc235720279 \h </w:instrText>
         </w:r>
         <w:r>
           <w:rPr>
@@ -554,7 +539,7 @@
           <w14:ligatures w14:val="standardContextual"/>
         </w:rPr>
       </w:pPr>
-      <w:hyperlink w:anchor="_Toc235720189" w:history="1">
+      <w:hyperlink w:anchor="_Toc235720280" w:history="1">
         <w:r>
           <w:rPr>
             <w:rStyle w:val="Hyperlink"/>
@@ -581,7 +566,7 @@
             <w:noProof/>
             <w:webHidden/>
           </w:rPr>
-          <w:instrText xml:space="preserve"> PAGEREF _Toc235720189 \h </w:instrText>
+          <w:instrText xml:space="preserve"> PAGEREF _Toc235720280 \h </w:instrText>
         </w:r>
         <w:r>
           <w:rPr>
@@ -628,7 +613,7 @@
           <w14:ligatures w14:val="standardContextual"/>
         </w:rPr>
       </w:pPr>
-      <w:hyperlink w:anchor="_Toc235720190" w:history="1">
+      <w:hyperlink w:anchor="_Toc235720281" w:history="1">
         <w:r>
           <w:rPr>
             <w:rStyle w:val="Hyperlink"/>
@@ -655,7 +640,7 @@
             <w:noProof/>
             <w:webHidden/>
           </w:rPr>
-          <w:instrText xml:space="preserve"> PAGEREF _Toc235720190 \h </w:instrText>
+          <w:instrText xml:space="preserve"> PAGEREF _Toc235720281 \h </w:instrText>
         </w:r>
         <w:r>
           <w:rPr>
@@ -702,7 +687,7 @@
           <w14:ligatures w14:val="standardContextual"/>
         </w:rPr>
       </w:pPr>
-      <w:hyperlink w:anchor="_Toc235720191" w:history="1">
+      <w:hyperlink w:anchor="_Toc235720282" w:history="1">
         <w:r>
           <w:rPr>
             <w:rStyle w:val="Hyperlink"/>
@@ -729,7 +714,7 @@
             <w:noProof/>
             <w:webHidden/>
           </w:rPr>
-          <w:instrText xml:space="preserve"> PAGEREF _Toc235720191 \h </w:instrText>
+          <w:instrText xml:space="preserve"> PAGEREF _Toc235720282 \h </w:instrText>
         </w:r>
         <w:r>
           <w:rPr>
@@ -776,7 +761,7 @@
           <w14:ligatures w14:val="standardContextual"/>
         </w:rPr>
       </w:pPr>
-      <w:hyperlink w:anchor="_Toc235720192" w:history="1">
+      <w:hyperlink w:anchor="_Toc235720283" w:history="1">
         <w:r>
           <w:rPr>
             <w:rStyle w:val="Hyperlink"/>
@@ -803,7 +788,7 @@
             <w:noProof/>
             <w:webHidden/>
           </w:rPr>
-          <w:instrText xml:space="preserve"> PAGEREF _Toc235720192 \h </w:instrText>
+          <w:instrText xml:space="preserve"> PAGEREF _Toc235720283 \h </w:instrText>
         </w:r>
         <w:r>
           <w:rPr>
@@ -850,7 +835,7 @@
           <w14:ligatures w14:val="standardContextual"/>
         </w:rPr>
       </w:pPr>
-      <w:hyperlink w:anchor="_Toc235720193" w:history="1">
+      <w:hyperlink w:anchor="_Toc235720284" w:history="1">
         <w:r>
           <w:rPr>
             <w:rStyle w:val="Hyperlink"/>
@@ -877,7 +862,7 @@
             <w:noProof/>
             <w:webHidden/>
           </w:rPr>
-          <w:instrText xml:space="preserve"> PAGEREF _Toc235720193 \h </w:instrText>
+          <w:instrText xml:space="preserve"> PAGEREF _Toc235720284 \h </w:instrText>
         </w:r>
         <w:r>
           <w:rPr>
@@ -924,7 +909,7 @@
           <w14:ligatures w14:val="standardContextual"/>
         </w:rPr>
       </w:pPr>
-      <w:hyperlink w:anchor="_Toc235720194" w:history="1">
+      <w:hyperlink w:anchor="_Toc235720285" w:history="1">
         <w:r>
           <w:rPr>
             <w:rStyle w:val="Hyperlink"/>
@@ -951,7 +936,7 @@
             <w:noProof/>
             <w:webHidden/>
           </w:rPr>
-          <w:instrText xml:space="preserve"> PAGEREF _Toc235720194 \h </w:instrText>
+          <w:instrText xml:space="preserve"> PAGEREF _Toc235720285 \h </w:instrText>
         </w:r>
         <w:r>
           <w:rPr>
@@ -998,7 +983,7 @@
           <w14:ligatures w14:val="standardContextual"/>
         </w:rPr>
       </w:pPr>
-      <w:hyperlink w:anchor="_Toc235720195" w:history="1">
+      <w:hyperlink w:anchor="_Toc235720286" w:history="1">
         <w:r>
           <w:rPr>
             <w:rStyle w:val="Hyperlink"/>
@@ -1025,7 +1010,7 @@
             <w:noProof/>
             <w:webHidden/>
           </w:rPr>
-          <w:instrText xml:space="preserve"> PAGEREF _Toc235720195 \h </w:instrText>
+          <w:instrText xml:space="preserve"> PAGEREF _Toc235720286 \h </w:instrText>
         </w:r>
         <w:r>
           <w:rPr>
@@ -1072,7 +1057,7 @@
           <w14:ligatures w14:val="standardContextual"/>
         </w:rPr>
       </w:pPr>
-      <w:hyperlink w:anchor="_Toc235720196" w:history="1">
+      <w:hyperlink w:anchor="_Toc235720287" w:history="1">
         <w:r>
           <w:rPr>
             <w:rStyle w:val="Hyperlink"/>
@@ -1099,7 +1084,7 @@
             <w:noProof/>
             <w:webHidden/>
           </w:rPr>
-          <w:instrText xml:space="preserve"> PAGEREF _Toc235720196 \h </w:instrText>
+          <w:instrText xml:space="preserve"> PAGEREF _Toc235720287 \h </w:instrText>
         </w:r>
         <w:r>
           <w:rPr>
@@ -1146,7 +1131,7 @@
           <w14:ligatures w14:val="standardContextual"/>
         </w:rPr>
       </w:pPr>
-      <w:hyperlink w:anchor="_Toc235720197" w:history="1">
+      <w:hyperlink w:anchor="_Toc235720288" w:history="1">
         <w:r>
           <w:rPr>
             <w:rStyle w:val="Hyperlink"/>
@@ -1173,7 +1158,7 @@
             <w:noProof/>
             <w:webHidden/>
           </w:rPr>
-          <w:instrText xml:space="preserve"> PAGEREF _Toc235720197 \h </w:instrText>
+          <w:instrText xml:space="preserve"> PAGEREF _Toc235720288 \h </w:instrText>
         </w:r>
         <w:r>
           <w:rPr>
@@ -1220,7 +1205,7 @@
           <w14:ligatures w14:val="standardContextual"/>
         </w:rPr>
       </w:pPr>
-      <w:hyperlink w:anchor="_Toc235720198" w:history="1">
+      <w:hyperlink w:anchor="_Toc235720289" w:history="1">
         <w:r>
           <w:rPr>
             <w:rStyle w:val="Hyperlink"/>
@@ -1247,7 +1232,7 @@
             <w:noProof/>
             <w:webHidden/>
           </w:rPr>
-          <w:instrText xml:space="preserve"> PAGEREF _Toc235720198 \h </w:instrText>
+          <w:instrText xml:space="preserve"> PAGEREF _Toc235720289 \h </w:instrText>
         </w:r>
         <w:r>
           <w:rPr>
@@ -1294,7 +1279,7 @@
           <w14:ligatures w14:val="standardContextual"/>
         </w:rPr>
       </w:pPr>
-      <w:hyperlink w:anchor="_Toc235720199" w:history="1">
+      <w:hyperlink w:anchor="_Toc235720290" w:history="1">
         <w:r>
           <w:rPr>
             <w:rStyle w:val="Hyperlink"/>
@@ -1321,7 +1306,7 @@
             <w:noProof/>
             <w:webHidden/>
           </w:rPr>
-          <w:instrText xml:space="preserve"> PAGEREF _Toc235720199 \h </w:instrText>
+          <w:instrText xml:space="preserve"> PAGEREF _Toc235720290 \h </w:instrText>
         </w:r>
         <w:r>
           <w:rPr>
@@ -1368,7 +1353,7 @@
           <w14:ligatures w14:val="standardContextual"/>
         </w:rPr>
       </w:pPr>
-      <w:hyperlink w:anchor="_Toc235720200" w:history="1">
+      <w:hyperlink w:anchor="_Toc235720291" w:history="1">
         <w:r>
           <w:rPr>
             <w:rStyle w:val="Hyperlink"/>
@@ -1395,7 +1380,7 @@
             <w:noProof/>
             <w:webHidden/>
           </w:rPr>
-          <w:instrText xml:space="preserve"> PAGEREF _Toc235720200 \h </w:instrText>
+          <w:instrText xml:space="preserve"> PAGEREF _Toc235720291 \h </w:instrText>
         </w:r>
         <w:r>
           <w:rPr>
@@ -1442,7 +1427,7 @@
           <w14:ligatures w14:val="standardContextual"/>
         </w:rPr>
       </w:pPr>
-      <w:hyperlink w:anchor="_Toc235720201" w:history="1">
+      <w:hyperlink w:anchor="_Toc235720292" w:history="1">
         <w:r>
           <w:rPr>
             <w:rStyle w:val="Hyperlink"/>
@@ -1469,7 +1454,7 @@
             <w:noProof/>
             <w:webHidden/>
           </w:rPr>
-          <w:instrText xml:space="preserve"> PAGEREF _Toc235720201 \h </w:instrText>
+          <w:instrText xml:space="preserve"> PAGEREF _Toc235720292 \h </w:instrText>
         </w:r>
         <w:r>
           <w:rPr>
@@ -1516,7 +1501,7 @@
           <w14:ligatures w14:val="standardContextual"/>
         </w:rPr>
       </w:pPr>
-      <w:hyperlink w:anchor="_Toc235720202" w:history="1">
+      <w:hyperlink w:anchor="_Toc235720293" w:history="1">
         <w:r>
           <w:rPr>
             <w:rStyle w:val="Hyperlink"/>
@@ -1543,7 +1528,7 @@
             <w:noProof/>
             <w:webHidden/>
           </w:rPr>
-          <w:instrText xml:space="preserve"> PAGEREF _Toc235720202 \h </w:instrText>
+          <w:instrText xml:space="preserve"> PAGEREF _Toc235720293 \h </w:instrText>
         </w:r>
         <w:r>
           <w:rPr>
@@ -1590,7 +1575,7 @@
           <w14:ligatures w14:val="standardContextual"/>
         </w:rPr>
       </w:pPr>
-      <w:hyperlink w:anchor="_Toc235720203" w:history="1">
+      <w:hyperlink w:anchor="_Toc235720294" w:history="1">
         <w:r>
           <w:rPr>
             <w:rStyle w:val="Hyperlink"/>
@@ -1617,7 +1602,7 @@
             <w:noProof/>
             <w:webHidden/>
           </w:rPr>
-          <w:instrText xml:space="preserve"> PAGEREF _Toc235720203 \h </w:instrText>
+          <w:instrText xml:space="preserve"> PAGEREF _Toc235720294 \h </w:instrText>
         </w:r>
         <w:r>
           <w:rPr>
@@ -1664,7 +1649,7 @@
           <w14:ligatures w14:val="standardContextual"/>
         </w:rPr>
       </w:pPr>
-      <w:hyperlink w:anchor="_Toc235720204" w:history="1">
+      <w:hyperlink w:anchor="_Toc235720295" w:history="1">
         <w:r>
           <w:rPr>
             <w:rStyle w:val="Hyperlink"/>
@@ -1691,7 +1676,7 @@
             <w:noProof/>
             <w:webHidden/>
           </w:rPr>
-          <w:instrText xml:space="preserve"> PAGEREF _Toc235720204 \h </w:instrText>
+          <w:instrText xml:space="preserve"> PAGEREF _Toc235720295 \h </w:instrText>
         </w:r>
         <w:r>
           <w:rPr>
@@ -1738,7 +1723,7 @@
           <w14:ligatures w14:val="standardContextual"/>
         </w:rPr>
       </w:pPr>
-      <w:hyperlink w:anchor="_Toc235720205" w:history="1">
+      <w:hyperlink w:anchor="_Toc235720296" w:history="1">
         <w:r>
           <w:rPr>
             <w:rStyle w:val="Hyperlink"/>
@@ -1765,7 +1750,7 @@
             <w:noProof/>
             <w:webHidden/>
           </w:rPr>
-          <w:instrText xml:space="preserve"> PAGEREF _Toc235720205 \h </w:instrText>
+          <w:instrText xml:space="preserve"> PAGEREF _Toc235720296 \h </w:instrText>
         </w:r>
         <w:r>
           <w:rPr>
@@ -1812,7 +1797,7 @@
           <w14:ligatures w14:val="standardContextual"/>
         </w:rPr>
       </w:pPr>
-      <w:hyperlink w:anchor="_Toc235720206" w:history="1">
+      <w:hyperlink w:anchor="_Toc235720297" w:history="1">
         <w:r>
           <w:rPr>
             <w:rStyle w:val="Hyperlink"/>
@@ -1839,7 +1824,7 @@
             <w:noProof/>
             <w:webHidden/>
           </w:rPr>
-          <w:instrText xml:space="preserve"> PAGEREF _Toc235720206 \h </w:instrText>
+          <w:instrText xml:space="preserve"> PAGEREF _Toc235720297 \h </w:instrText>
         </w:r>
         <w:r>
           <w:rPr>
@@ -1886,7 +1871,7 @@
           <w14:ligatures w14:val="standardContextual"/>
         </w:rPr>
       </w:pPr>
-      <w:hyperlink w:anchor="_Toc235720207" w:history="1">
+      <w:hyperlink w:anchor="_Toc235720298" w:history="1">
         <w:r>
           <w:rPr>
             <w:rStyle w:val="Hyperlink"/>
@@ -1913,7 +1898,7 @@
             <w:noProof/>
             <w:webHidden/>
           </w:rPr>
-          <w:instrText xml:space="preserve"> PAGEREF _Toc235720207 \h </w:instrText>
+          <w:instrText xml:space="preserve"> PAGEREF _Toc235720298 \h </w:instrText>
         </w:r>
         <w:r>
           <w:rPr>
@@ -1960,7 +1945,7 @@
           <w14:ligatures w14:val="standardContextual"/>
         </w:rPr>
       </w:pPr>
-      <w:hyperlink w:anchor="_Toc235720208" w:history="1">
+      <w:hyperlink w:anchor="_Toc235720299" w:history="1">
         <w:r>
           <w:rPr>
             <w:rStyle w:val="Hyperlink"/>
@@ -1987,7 +1972,7 @@
             <w:noProof/>
             <w:webHidden/>
           </w:rPr>
-          <w:instrText xml:space="preserve"> PAGEREF _Toc235720208 \h </w:instrText>
+          <w:instrText xml:space="preserve"> PAGEREF _Toc235720299 \h </w:instrText>
         </w:r>
         <w:r>
           <w:rPr>
@@ -2034,7 +2019,7 @@
           <w14:ligatures w14:val="standardContextual"/>
         </w:rPr>
       </w:pPr>
-      <w:hyperlink w:anchor="_Toc235720209" w:history="1">
+      <w:hyperlink w:anchor="_Toc235720300" w:history="1">
         <w:r>
           <w:rPr>
             <w:rStyle w:val="Hyperlink"/>
@@ -2061,7 +2046,7 @@
             <w:noProof/>
             <w:webHidden/>
           </w:rPr>
-          <w:instrText xml:space="preserve"> PAGEREF _Toc235720209 \h </w:instrText>
+          <w:instrText xml:space="preserve"> PAGEREF _Toc235720300 \h </w:instrText>
         </w:r>
         <w:r>
           <w:rPr>
@@ -2108,7 +2093,7 @@
           <w14:ligatures w14:val="standardContextual"/>
         </w:rPr>
       </w:pPr>
-      <w:hyperlink w:anchor="_Toc235720210" w:history="1">
+      <w:hyperlink w:anchor="_Toc235720301" w:history="1">
         <w:r>
           <w:rPr>
             <w:rStyle w:val="Hyperlink"/>
@@ -2135,7 +2120,7 @@
             <w:noProof/>
             <w:webHidden/>
           </w:rPr>
-          <w:instrText xml:space="preserve"> PAGEREF _Toc235720210 \h </w:instrText>
+          <w:instrText xml:space="preserve"> PAGEREF _Toc235720301 \h </w:instrText>
         </w:r>
         <w:r>
           <w:rPr>
@@ -2182,7 +2167,7 @@
           <w14:ligatures w14:val="standardContextual"/>
         </w:rPr>
       </w:pPr>
-      <w:hyperlink w:anchor="_Toc235720211" w:history="1">
+      <w:hyperlink w:anchor="_Toc235720302" w:history="1">
         <w:r>
           <w:rPr>
             <w:rStyle w:val="Hyperlink"/>
@@ -2209,7 +2194,7 @@
             <w:noProof/>
             <w:webHidden/>
           </w:rPr>
-          <w:instrText xml:space="preserve"> PAGEREF _Toc235720211 \h </w:instrText>
+          <w:instrText xml:space="preserve"> PAGEREF _Toc235720302 \h </w:instrText>
         </w:r>
         <w:r>
           <w:rPr>
@@ -2256,7 +2241,7 @@
           <w14:ligatures w14:val="standardContextual"/>
         </w:rPr>
       </w:pPr>
-      <w:hyperlink w:anchor="_Toc235720212" w:history="1">
+      <w:hyperlink w:anchor="_Toc235720303" w:history="1">
         <w:r>
           <w:rPr>
             <w:rStyle w:val="Hyperlink"/>
@@ -2283,7 +2268,7 @@
             <w:noProof/>
             <w:webHidden/>
           </w:rPr>
-          <w:instrText xml:space="preserve"> PAGEREF _Toc235720212 \h </w:instrText>
+          <w:instrText xml:space="preserve"> PAGEREF _Toc235720303 \h </w:instrText>
         </w:r>
         <w:r>
           <w:rPr>
@@ -2330,7 +2315,7 @@
           <w14:ligatures w14:val="standardContextual"/>
         </w:rPr>
       </w:pPr>
-      <w:hyperlink w:anchor="_Toc235720213" w:history="1">
+      <w:hyperlink w:anchor="_Toc235720304" w:history="1">
         <w:r>
           <w:rPr>
             <w:rStyle w:val="Hyperlink"/>
@@ -2357,7 +2342,7 @@
             <w:noProof/>
             <w:webHidden/>
           </w:rPr>
-          <w:instrText xml:space="preserve"> PAGEREF _Toc235720213 \h </w:instrText>
+          <w:instrText xml:space="preserve"> PAGEREF _Toc235720304 \h </w:instrText>
         </w:r>
         <w:r>
           <w:rPr>
@@ -2404,7 +2389,7 @@
           <w14:ligatures w14:val="standardContextual"/>
         </w:rPr>
       </w:pPr>
-      <w:hyperlink w:anchor="_Toc235720214" w:history="1">
+      <w:hyperlink w:anchor="_Toc235720305" w:history="1">
         <w:r>
           <w:rPr>
             <w:rStyle w:val="Hyperlink"/>
@@ -2431,7 +2416,7 @@
             <w:noProof/>
             <w:webHidden/>
           </w:rPr>
-          <w:instrText xml:space="preserve"> PAGEREF _Toc235720214 \h </w:instrText>
+          <w:instrText xml:space="preserve"> PAGEREF _Toc235720305 \h </w:instrText>
         </w:r>
         <w:r>
           <w:rPr>
@@ -2478,7 +2463,7 @@
           <w14:ligatures w14:val="standardContextual"/>
         </w:rPr>
       </w:pPr>
-      <w:hyperlink w:anchor="_Toc235720215" w:history="1">
+      <w:hyperlink w:anchor="_Toc235720306" w:history="1">
         <w:r>
           <w:rPr>
             <w:rStyle w:val="Hyperlink"/>
@@ -2505,7 +2490,7 @@
             <w:noProof/>
             <w:webHidden/>
           </w:rPr>
-          <w:instrText xml:space="preserve"> PAGEREF _Toc235720215 \h </w:instrText>
+          <w:instrText xml:space="preserve"> PAGEREF _Toc235720306 \h </w:instrText>
         </w:r>
         <w:r>
           <w:rPr>
@@ -2552,7 +2537,7 @@
           <w14:ligatures w14:val="standardContextual"/>
         </w:rPr>
       </w:pPr>
-      <w:hyperlink w:anchor="_Toc235720216" w:history="1">
+      <w:hyperlink w:anchor="_Toc235720307" w:history="1">
         <w:r>
           <w:rPr>
             <w:rStyle w:val="Hyperlink"/>
@@ -2579,7 +2564,7 @@
             <w:noProof/>
             <w:webHidden/>
           </w:rPr>
-          <w:instrText xml:space="preserve"> PAGEREF _Toc235720216 \h </w:instrText>
+          <w:instrText xml:space="preserve"> PAGEREF _Toc235720307 \h </w:instrText>
         </w:r>
         <w:r>
           <w:rPr>
@@ -2626,7 +2611,7 @@
           <w14:ligatures w14:val="standardContextual"/>
         </w:rPr>
       </w:pPr>
-      <w:hyperlink w:anchor="_Toc235720217" w:history="1">
+      <w:hyperlink w:anchor="_Toc235720308" w:history="1">
         <w:r>
           <w:rPr>
             <w:rStyle w:val="Hyperlink"/>
@@ -2653,7 +2638,7 @@
             <w:noProof/>
             <w:webHidden/>
           </w:rPr>
-          <w:instrText xml:space="preserve"> PAGEREF _Toc235720217 \h </w:instrText>
+          <w:instrText xml:space="preserve"> PAGEREF _Toc235720308 \h </w:instrText>
         </w:r>
         <w:r>
           <w:rPr>
@@ -2700,7 +2685,7 @@
           <w14:ligatures w14:val="standardContextual"/>
         </w:rPr>
       </w:pPr>
-      <w:hyperlink w:anchor="_Toc235720218" w:history="1">
+      <w:hyperlink w:anchor="_Toc235720309" w:history="1">
         <w:r>
           <w:rPr>
             <w:rStyle w:val="Hyperlink"/>
@@ -2727,7 +2712,7 @@
             <w:noProof/>
             <w:webHidden/>
           </w:rPr>
-          <w:instrText xml:space="preserve"> PAGEREF _Toc235720218 \h </w:instrText>
+          <w:instrText xml:space="preserve"> PAGEREF _Toc235720309 \h </w:instrText>
         </w:r>
         <w:r>
           <w:rPr>
@@ -2774,7 +2759,7 @@
           <w14:ligatures w14:val="standardContextual"/>
         </w:rPr>
       </w:pPr>
-      <w:hyperlink w:anchor="_Toc235720219" w:history="1">
+      <w:hyperlink w:anchor="_Toc235720310" w:history="1">
         <w:r>
           <w:rPr>
             <w:rStyle w:val="Hyperlink"/>
@@ -2801,7 +2786,7 @@
             <w:noProof/>
             <w:webHidden/>
           </w:rPr>
-          <w:instrText xml:space="preserve"> PAGEREF _Toc235720219 \h </w:instrText>
+          <w:instrText xml:space="preserve"> PAGEREF _Toc235720310 \h </w:instrText>
         </w:r>
         <w:r>
           <w:rPr>
@@ -2848,7 +2833,7 @@
           <w14:ligatures w14:val="standardContextual"/>
         </w:rPr>
       </w:pPr>
-      <w:hyperlink w:anchor="_Toc235720220" w:history="1">
+      <w:hyperlink w:anchor="_Toc235720311" w:history="1">
         <w:r>
           <w:rPr>
             <w:rStyle w:val="Hyperlink"/>
@@ -2875,7 +2860,7 @@
             <w:noProof/>
             <w:webHidden/>
           </w:rPr>
-          <w:instrText xml:space="preserve"> PAGEREF _Toc235720220 \h </w:instrText>
+          <w:instrText xml:space="preserve"> PAGEREF _Toc235720311 \h </w:instrText>
         </w:r>
         <w:r>
           <w:rPr>
@@ -2922,7 +2907,7 @@
           <w14:ligatures w14:val="standardContextual"/>
         </w:rPr>
       </w:pPr>
-      <w:hyperlink w:anchor="_Toc235720221" w:history="1">
+      <w:hyperlink w:anchor="_Toc235720312" w:history="1">
         <w:r>
           <w:rPr>
             <w:rStyle w:val="Hyperlink"/>
@@ -2949,7 +2934,7 @@
             <w:noProof/>
             <w:webHidden/>
           </w:rPr>
-          <w:instrText xml:space="preserve"> PAGEREF _Toc235720221 \h </w:instrText>
+          <w:instrText xml:space="preserve"> PAGEREF _Toc235720312 \h </w:instrText>
         </w:r>
         <w:r>
           <w:rPr>
@@ -3029,7 +3014,7 @@
       <w:r>
         <w:fldChar w:fldCharType="separate"/>
       </w:r>
-      <w:hyperlink w:anchor="_Toc235720222" w:history="1">
+      <w:hyperlink w:anchor="_Toc235720313" w:history="1">
         <w:r>
           <w:rPr>
             <w:rStyle w:val="Hyperlink"/>
@@ -3056,7 +3041,7 @@
             <w:noProof/>
             <w:webHidden/>
           </w:rPr>
-          <w:instrText xml:space="preserve"> PAGEREF _Toc235720222 \h </w:instrText>
+          <w:instrText xml:space="preserve"> PAGEREF _Toc235720313 \h </w:instrText>
         </w:r>
         <w:r>
           <w:rPr>
@@ -3103,7 +3088,7 @@
           <w14:ligatures w14:val="standardContextual"/>
         </w:rPr>
       </w:pPr>
-      <w:hyperlink w:anchor="_Toc235720223" w:history="1">
+      <w:hyperlink w:anchor="_Toc235720314" w:history="1">
         <w:r>
           <w:rPr>
             <w:rStyle w:val="Hyperlink"/>
@@ -3130,7 +3115,7 @@
             <w:noProof/>
             <w:webHidden/>
           </w:rPr>
-          <w:instrText xml:space="preserve"> PAGEREF _Toc235720223 \h </w:instrText>
+          <w:instrText xml:space="preserve"> PAGEREF _Toc235720314 \h </w:instrText>
         </w:r>
         <w:r>
           <w:rPr>
@@ -3177,7 +3162,7 @@
           <w14:ligatures w14:val="standardContextual"/>
         </w:rPr>
       </w:pPr>
-      <w:hyperlink w:anchor="_Toc235720224" w:history="1">
+      <w:hyperlink w:anchor="_Toc235720315" w:history="1">
         <w:r>
           <w:rPr>
             <w:rStyle w:val="Hyperlink"/>
@@ -3204,7 +3189,7 @@
             <w:noProof/>
             <w:webHidden/>
           </w:rPr>
-          <w:instrText xml:space="preserve"> PAGEREF _Toc235720224 \h </w:instrText>
+          <w:instrText xml:space="preserve"> PAGEREF _Toc235720315 \h </w:instrText>
         </w:r>
         <w:r>
           <w:rPr>
@@ -3251,7 +3236,7 @@
           <w14:ligatures w14:val="standardContextual"/>
         </w:rPr>
       </w:pPr>
-      <w:hyperlink w:anchor="_Toc235720225" w:history="1">
+      <w:hyperlink w:anchor="_Toc235720316" w:history="1">
         <w:r>
           <w:rPr>
             <w:rStyle w:val="Hyperlink"/>
@@ -3278,7 +3263,7 @@
             <w:noProof/>
             <w:webHidden/>
           </w:rPr>
-          <w:instrText xml:space="preserve"> PAGEREF _Toc235720225 \h </w:instrText>
+          <w:instrText xml:space="preserve"> PAGEREF _Toc235720316 \h </w:instrText>
         </w:r>
         <w:r>
           <w:rPr>
@@ -3325,7 +3310,7 @@
           <w14:ligatures w14:val="standardContextual"/>
         </w:rPr>
       </w:pPr>
-      <w:hyperlink w:anchor="_Toc235720226" w:history="1">
+      <w:hyperlink w:anchor="_Toc235720317" w:history="1">
         <w:r>
           <w:rPr>
             <w:rStyle w:val="Hyperlink"/>
@@ -3352,7 +3337,7 @@
             <w:noProof/>
             <w:webHidden/>
           </w:rPr>
-          <w:instrText xml:space="preserve"> PAGEREF _Toc235720226 \h </w:instrText>
+          <w:instrText xml:space="preserve"> PAGEREF _Toc235720317 \h </w:instrText>
         </w:r>
         <w:r>
           <w:rPr>
@@ -3399,7 +3384,7 @@
           <w14:ligatures w14:val="standardContextual"/>
         </w:rPr>
       </w:pPr>
-      <w:hyperlink w:anchor="_Toc235720227" w:history="1">
+      <w:hyperlink w:anchor="_Toc235720318" w:history="1">
         <w:r>
           <w:rPr>
             <w:rStyle w:val="Hyperlink"/>
@@ -3426,7 +3411,7 @@
             <w:noProof/>
             <w:webHidden/>
           </w:rPr>
-          <w:instrText xml:space="preserve"> PAGEREF _Toc235720227 \h </w:instrText>
+          <w:instrText xml:space="preserve"> PAGEREF _Toc235720318 \h </w:instrText>
         </w:r>
         <w:r>
           <w:rPr>
@@ -3473,7 +3458,7 @@
           <w14:ligatures w14:val="standardContextual"/>
         </w:rPr>
       </w:pPr>
-      <w:hyperlink w:anchor="_Toc235720228" w:history="1">
+      <w:hyperlink w:anchor="_Toc235720319" w:history="1">
         <w:r>
           <w:rPr>
             <w:rStyle w:val="Hyperlink"/>
@@ -3500,7 +3485,7 @@
             <w:noProof/>
             <w:webHidden/>
           </w:rPr>
-          <w:instrText xml:space="preserve"> PAGEREF _Toc235720228 \h </w:instrText>
+          <w:instrText xml:space="preserve"> PAGEREF _Toc235720319 \h </w:instrText>
         </w:r>
         <w:r>
           <w:rPr>
@@ -3547,7 +3532,7 @@
           <w14:ligatures w14:val="standardContextual"/>
         </w:rPr>
       </w:pPr>
-      <w:hyperlink w:anchor="_Toc235720229" w:history="1">
+      <w:hyperlink w:anchor="_Toc235720320" w:history="1">
         <w:r>
           <w:rPr>
             <w:rStyle w:val="Hyperlink"/>
@@ -3574,7 +3559,7 @@
             <w:noProof/>
             <w:webHidden/>
           </w:rPr>
-          <w:instrText xml:space="preserve"> PAGEREF _Toc235720229 \h </w:instrText>
+          <w:instrText xml:space="preserve"> PAGEREF _Toc235720320 \h </w:instrText>
         </w:r>
         <w:r>
           <w:rPr>
@@ -3621,7 +3606,7 @@
           <w14:ligatures w14:val="standardContextual"/>
         </w:rPr>
       </w:pPr>
-      <w:hyperlink w:anchor="_Toc235720230" w:history="1">
+      <w:hyperlink w:anchor="_Toc235720321" w:history="1">
         <w:r>
           <w:rPr>
             <w:rStyle w:val="Hyperlink"/>
@@ -3648,7 +3633,7 @@
             <w:noProof/>
             <w:webHidden/>
           </w:rPr>
-          <w:instrText xml:space="preserve"> PAGEREF _Toc235720230 \h </w:instrText>
+          <w:instrText xml:space="preserve"> PAGEREF _Toc235720321 \h </w:instrText>
         </w:r>
         <w:r>
           <w:rPr>
@@ -3695,7 +3680,7 @@
           <w14:ligatures w14:val="standardContextual"/>
         </w:rPr>
       </w:pPr>
-      <w:hyperlink w:anchor="_Toc235720231" w:history="1">
+      <w:hyperlink w:anchor="_Toc235720322" w:history="1">
         <w:r>
           <w:rPr>
             <w:rStyle w:val="Hyperlink"/>
@@ -3722,7 +3707,7 @@
             <w:noProof/>
             <w:webHidden/>
           </w:rPr>
-          <w:instrText xml:space="preserve"> PAGEREF _Toc235720231 \h </w:instrText>
+          <w:instrText xml:space="preserve"> PAGEREF _Toc235720322 \h </w:instrText>
         </w:r>
         <w:r>
           <w:rPr>
@@ -3769,7 +3754,7 @@
           <w14:ligatures w14:val="standardContextual"/>
         </w:rPr>
       </w:pPr>
-      <w:hyperlink w:anchor="_Toc235720232" w:history="1">
+      <w:hyperlink w:anchor="_Toc235720323" w:history="1">
         <w:r>
           <w:rPr>
             <w:rStyle w:val="Hyperlink"/>
@@ -3796,7 +3781,7 @@
             <w:noProof/>
             <w:webHidden/>
           </w:rPr>
-          <w:instrText xml:space="preserve"> PAGEREF _Toc235720232 \h </w:instrText>
+          <w:instrText xml:space="preserve"> PAGEREF _Toc235720323 \h </w:instrText>
         </w:r>
         <w:r>
           <w:rPr>
@@ -3870,7 +3855,7 @@
       <w:r>
         <w:fldChar w:fldCharType="separate"/>
       </w:r>
-      <w:hyperlink w:anchor="_Toc235720233" w:history="1">
+      <w:hyperlink w:anchor="_Toc235720324" w:history="1">
         <w:r>
           <w:rPr>
             <w:rStyle w:val="Hyperlink"/>
@@ -3897,7 +3882,7 @@
             <w:noProof/>
             <w:webHidden/>
           </w:rPr>
-          <w:instrText xml:space="preserve"> PAGEREF _Toc235720233 \h </w:instrText>
+          <w:instrText xml:space="preserve"> PAGEREF _Toc235720324 \h </w:instrText>
         </w:r>
         <w:r>
           <w:rPr>
@@ -3944,7 +3929,7 @@
           <w14:ligatures w14:val="standardContextual"/>
         </w:rPr>
       </w:pPr>
-      <w:hyperlink w:anchor="_Toc235720234" w:history="1">
+      <w:hyperlink w:anchor="_Toc235720325" w:history="1">
         <w:r>
           <w:rPr>
             <w:rStyle w:val="Hyperlink"/>
@@ -3971,7 +3956,7 @@
             <w:noProof/>
             <w:webHidden/>
           </w:rPr>
-          <w:instrText xml:space="preserve"> PAGEREF _Toc235720234 \h </w:instrText>
+          <w:instrText xml:space="preserve"> PAGEREF _Toc235720325 \h </w:instrText>
         </w:r>
         <w:r>
           <w:rPr>
@@ -4018,7 +4003,7 @@
           <w14:ligatures w14:val="standardContextual"/>
         </w:rPr>
       </w:pPr>
-      <w:hyperlink w:anchor="_Toc235720235" w:history="1">
+      <w:hyperlink w:anchor="_Toc235720326" w:history="1">
         <w:r>
           <w:rPr>
             <w:rStyle w:val="Hyperlink"/>
@@ -4045,7 +4030,7 @@
             <w:noProof/>
             <w:webHidden/>
           </w:rPr>
-          <w:instrText xml:space="preserve"> PAGEREF _Toc235720235 \h </w:instrText>
+          <w:instrText xml:space="preserve"> PAGEREF _Toc235720326 \h </w:instrText>
         </w:r>
         <w:r>
           <w:rPr>
@@ -4092,7 +4077,7 @@
           <w14:ligatures w14:val="standardContextual"/>
         </w:rPr>
       </w:pPr>
-      <w:hyperlink w:anchor="_Toc235720236" w:history="1">
+      <w:hyperlink w:anchor="_Toc235720327" w:history="1">
         <w:r>
           <w:rPr>
             <w:rStyle w:val="Hyperlink"/>
@@ -4119,7 +4104,7 @@
             <w:noProof/>
             <w:webHidden/>
           </w:rPr>
-          <w:instrText xml:space="preserve"> PAGEREF _Toc235720236 \h </w:instrText>
+          <w:instrText xml:space="preserve"> PAGEREF _Toc235720327 \h </w:instrText>
         </w:r>
         <w:r>
           <w:rPr>
@@ -4166,7 +4151,7 @@
           <w14:ligatures w14:val="standardContextual"/>
         </w:rPr>
       </w:pPr>
-      <w:hyperlink w:anchor="_Toc235720237" w:history="1">
+      <w:hyperlink w:anchor="_Toc235720328" w:history="1">
         <w:r>
           <w:rPr>
             <w:rStyle w:val="Hyperlink"/>
@@ -4193,7 +4178,7 @@
             <w:noProof/>
             <w:webHidden/>
           </w:rPr>
-          <w:instrText xml:space="preserve"> PAGEREF _Toc235720237 \h </w:instrText>
+          <w:instrText xml:space="preserve"> PAGEREF _Toc235720328 \h </w:instrText>
         </w:r>
         <w:r>
           <w:rPr>
@@ -4240,7 +4225,7 @@
           <w14:ligatures w14:val="standardContextual"/>
         </w:rPr>
       </w:pPr>
-      <w:hyperlink w:anchor="_Toc235720238" w:history="1">
+      <w:hyperlink w:anchor="_Toc235720329" w:history="1">
         <w:r>
           <w:rPr>
             <w:rStyle w:val="Hyperlink"/>
@@ -4267,7 +4252,7 @@
             <w:noProof/>
             <w:webHidden/>
           </w:rPr>
-          <w:instrText xml:space="preserve"> PAGEREF _Toc235720238 \h </w:instrText>
+          <w:instrText xml:space="preserve"> PAGEREF _Toc235720329 \h </w:instrText>
         </w:r>
         <w:r>
           <w:rPr>
@@ -4314,7 +4299,7 @@
           <w14:ligatures w14:val="standardContextual"/>
         </w:rPr>
       </w:pPr>
-      <w:hyperlink w:anchor="_Toc235720239" w:history="1">
+      <w:hyperlink w:anchor="_Toc235720330" w:history="1">
         <w:r>
           <w:rPr>
             <w:rStyle w:val="Hyperlink"/>
@@ -4341,7 +4326,7 @@
             <w:noProof/>
             <w:webHidden/>
           </w:rPr>
-          <w:instrText xml:space="preserve"> PAGEREF _Toc235720239 \h </w:instrText>
+          <w:instrText xml:space="preserve"> PAGEREF _Toc235720330 \h </w:instrText>
         </w:r>
         <w:r>
           <w:rPr>
@@ -4388,7 +4373,7 @@
           <w14:ligatures w14:val="standardContextual"/>
         </w:rPr>
       </w:pPr>
-      <w:hyperlink w:anchor="_Toc235720240" w:history="1">
+      <w:hyperlink w:anchor="_Toc235720331" w:history="1">
         <w:r>
           <w:rPr>
             <w:rStyle w:val="Hyperlink"/>
@@ -4415,7 +4400,7 @@
             <w:noProof/>
             <w:webHidden/>
           </w:rPr>
-          <w:instrText xml:space="preserve"> PAGEREF _Toc235720240 \h </w:instrText>
+          <w:instrText xml:space="preserve"> PAGEREF _Toc235720331 \h </w:instrText>
         </w:r>
         <w:r>
           <w:rPr>
@@ -4468,7 +4453,7 @@
       <w:pPr>
         <w:pStyle w:val="Heading1"/>
       </w:pPr>
-      <w:bookmarkStart w:id="0" w:name="_Toc235720185"/>
+      <w:bookmarkStart w:id="0" w:name="_Toc235720276"/>
       <w:r>
         <w:rPr>
           <w:rFonts w:ascii="Times New Roman" w:hAnsi="Times New Roman"/>
@@ -4482,7 +4467,7 @@
       <w:pPr>
         <w:pStyle w:val="Heading2"/>
       </w:pPr>
-      <w:bookmarkStart w:id="1" w:name="_Toc235720186"/>
+      <w:bookmarkStart w:id="1" w:name="_Toc235720277"/>
       <w:r>
         <w:rPr>
           <w:rFonts w:ascii="Times New Roman" w:hAnsi="Times New Roman"/>
@@ -4508,7 +4493,7 @@
       <w:pPr>
         <w:pStyle w:val="Heading2"/>
       </w:pPr>
-      <w:bookmarkStart w:id="2" w:name="_Toc235720187"/>
+      <w:bookmarkStart w:id="2" w:name="_Toc235720278"/>
       <w:r>
         <w:rPr>
           <w:rFonts w:ascii="Times New Roman" w:hAnsi="Times New Roman"/>
@@ -4526,7 +4511,7 @@
       <w:pPr>
         <w:pStyle w:val="Heading2"/>
       </w:pPr>
-      <w:bookmarkStart w:id="3" w:name="_Toc235720188"/>
+      <w:bookmarkStart w:id="3" w:name="_Toc235720279"/>
       <w:r>
         <w:rPr>
           <w:rFonts w:ascii="Times New Roman" w:hAnsi="Times New Roman"/>
@@ -4612,7 +4597,7 @@
       <w:pPr>
         <w:pStyle w:val="Heading2"/>
       </w:pPr>
-      <w:bookmarkStart w:id="4" w:name="_Toc235720189"/>
+      <w:bookmarkStart w:id="4" w:name="_Toc235720280"/>
       <w:r>
         <w:rPr>
           <w:rFonts w:ascii="Times New Roman" w:hAnsi="Times New Roman"/>
@@ -4633,7 +4618,7 @@
       <w:pPr>
         <w:pStyle w:val="Heading2"/>
       </w:pPr>
-      <w:bookmarkStart w:id="5" w:name="_Toc235720190"/>
+      <w:bookmarkStart w:id="5" w:name="_Toc235720281"/>
       <w:r>
         <w:rPr>
           <w:rFonts w:ascii="Times New Roman" w:hAnsi="Times New Roman"/>
@@ -4651,7 +4636,7 @@
       <w:pPr>
         <w:pStyle w:val="Heading1"/>
       </w:pPr>
-      <w:bookmarkStart w:id="6" w:name="_Toc235720191"/>
+      <w:bookmarkStart w:id="6" w:name="_Toc235720282"/>
       <w:r>
         <w:rPr>
           <w:rFonts w:ascii="Times New Roman" w:hAnsi="Times New Roman"/>
@@ -4665,7 +4650,7 @@
       <w:pPr>
         <w:pStyle w:val="Heading2"/>
       </w:pPr>
-      <w:bookmarkStart w:id="7" w:name="_Toc235720192"/>
+      <w:bookmarkStart w:id="7" w:name="_Toc235720283"/>
       <w:r>
         <w:rPr>
           <w:rFonts w:ascii="Times New Roman" w:hAnsi="Times New Roman"/>
@@ -4686,7 +4671,7 @@
       <w:pPr>
         <w:pStyle w:val="Heading2"/>
       </w:pPr>
-      <w:bookmarkStart w:id="8" w:name="_Toc235720193"/>
+      <w:bookmarkStart w:id="8" w:name="_Toc235720284"/>
       <w:r>
         <w:rPr>
           <w:rFonts w:ascii="Times New Roman" w:hAnsi="Times New Roman"/>
@@ -4712,7 +4697,7 @@
       <w:pPr>
         <w:pStyle w:val="Heading2"/>
       </w:pPr>
-      <w:bookmarkStart w:id="9" w:name="_Toc235720194"/>
+      <w:bookmarkStart w:id="9" w:name="_Toc235720285"/>
       <w:r>
         <w:rPr>
           <w:rFonts w:ascii="Times New Roman" w:hAnsi="Times New Roman"/>
@@ -4734,7 +4719,7 @@
       <w:pPr>
         <w:pStyle w:val="Heading2"/>
       </w:pPr>
-      <w:bookmarkStart w:id="10" w:name="_Toc235720195"/>
+      <w:bookmarkStart w:id="10" w:name="_Toc235720286"/>
       <w:r>
         <w:rPr>
           <w:rFonts w:ascii="Times New Roman" w:hAnsi="Times New Roman"/>
@@ -4752,7 +4737,7 @@
       <w:pPr>
         <w:pStyle w:val="Heading1"/>
       </w:pPr>
-      <w:bookmarkStart w:id="11" w:name="_Toc235720196"/>
+      <w:bookmarkStart w:id="11" w:name="_Toc235720287"/>
       <w:r>
         <w:rPr>
           <w:rFonts w:ascii="Times New Roman" w:hAnsi="Times New Roman"/>
@@ -4766,7 +4751,7 @@
       <w:pPr>
         <w:pStyle w:val="Heading2"/>
       </w:pPr>
-      <w:bookmarkStart w:id="12" w:name="_Toc235720197"/>
+      <w:bookmarkStart w:id="12" w:name="_Toc235720288"/>
       <w:r>
         <w:rPr>
           <w:rFonts w:ascii="Times New Roman" w:hAnsi="Times New Roman"/>
@@ -4787,7 +4772,7 @@
       <w:pPr>
         <w:pStyle w:val="Heading2"/>
       </w:pPr>
-      <w:bookmarkStart w:id="13" w:name="_Toc235720198"/>
+      <w:bookmarkStart w:id="13" w:name="_Toc235720289"/>
       <w:r>
         <w:rPr>
           <w:rFonts w:ascii="Times New Roman" w:hAnsi="Times New Roman"/>
@@ -4806,7 +4791,7 @@
         <w:pStyle w:val="Caption"/>
         <w:jc w:val="center"/>
       </w:pPr>
-      <w:bookmarkStart w:id="14" w:name="_Toc235720233"/>
+      <w:bookmarkStart w:id="14" w:name="_Toc235720324"/>
       <w:r>
         <w:t xml:space="preserve">Table </w:t>
       </w:r>
@@ -5390,7 +5375,7 @@
       <w:pPr>
         <w:pStyle w:val="Heading2"/>
       </w:pPr>
-      <w:bookmarkStart w:id="15" w:name="_Toc235720199"/>
+      <w:bookmarkStart w:id="15" w:name="_Toc235720290"/>
       <w:r>
         <w:rPr>
           <w:rFonts w:ascii="Times New Roman" w:hAnsi="Times New Roman"/>
@@ -5409,7 +5394,7 @@
         <w:pStyle w:val="Caption"/>
         <w:jc w:val="center"/>
       </w:pPr>
-      <w:bookmarkStart w:id="16" w:name="_Toc235720234"/>
+      <w:bookmarkStart w:id="16" w:name="_Toc235720325"/>
       <w:r>
         <w:t xml:space="preserve">Table </w:t>
       </w:r>
@@ -5728,7 +5713,7 @@
       <w:pPr>
         <w:pStyle w:val="Heading2"/>
       </w:pPr>
-      <w:bookmarkStart w:id="17" w:name="_Toc235720200"/>
+      <w:bookmarkStart w:id="17" w:name="_Toc235720291"/>
       <w:r>
         <w:rPr>
           <w:rFonts w:ascii="Times New Roman" w:hAnsi="Times New Roman"/>
@@ -5746,7 +5731,7 @@
       <w:pPr>
         <w:pStyle w:val="Heading2"/>
       </w:pPr>
-      <w:bookmarkStart w:id="18" w:name="_Toc235720201"/>
+      <w:bookmarkStart w:id="18" w:name="_Toc235720292"/>
       <w:r>
         <w:rPr>
           <w:rFonts w:ascii="Times New Roman" w:hAnsi="Times New Roman"/>
@@ -5760,7 +5745,7 @@
         <w:pStyle w:val="Caption"/>
         <w:jc w:val="center"/>
       </w:pPr>
-      <w:bookmarkStart w:id="19" w:name="_Toc235720235"/>
+      <w:bookmarkStart w:id="19" w:name="_Toc235720326"/>
       <w:r>
         <w:t xml:space="preserve">Table </w:t>
       </w:r>
@@ -6085,7 +6070,7 @@
       <w:pPr>
         <w:pStyle w:val="Heading2"/>
       </w:pPr>
-      <w:bookmarkStart w:id="20" w:name="_Toc235720202"/>
+      <w:bookmarkStart w:id="20" w:name="_Toc235720293"/>
       <w:r>
         <w:rPr>
           <w:rFonts w:ascii="Times New Roman" w:hAnsi="Times New Roman"/>
@@ -6103,7 +6088,7 @@
       <w:pPr>
         <w:pStyle w:val="Heading1"/>
       </w:pPr>
-      <w:bookmarkStart w:id="21" w:name="_Toc235720203"/>
+      <w:bookmarkStart w:id="21" w:name="_Toc235720294"/>
       <w:r>
         <w:rPr>
           <w:rFonts w:ascii="Times New Roman" w:hAnsi="Times New Roman"/>
@@ -6117,7 +6102,7 @@
       <w:pPr>
         <w:pStyle w:val="Heading2"/>
       </w:pPr>
-      <w:bookmarkStart w:id="22" w:name="_Toc235720204"/>
+      <w:bookmarkStart w:id="22" w:name="_Toc235720295"/>
       <w:r>
         <w:rPr>
           <w:rFonts w:ascii="Times New Roman" w:hAnsi="Times New Roman"/>
@@ -6135,7 +6120,7 @@
           <w:noProof/>
         </w:rPr>
         <w:drawing>
-          <wp:inline distT="0" distB="0" distL="0" distR="0" wp14:anchorId="42E2B3BB" wp14:editId="0E15EBA5">
+          <wp:inline distT="0" distB="0" distL="0" distR="0" wp14:anchorId="0E4D3A38" wp14:editId="43BF2B8B">
             <wp:extent cx="3474720" cy="2779776"/>
             <wp:effectExtent l="0" t="0" r="0" b="0"/>
             <wp:docPr id="1" name="Picture 1"/>
@@ -6176,7 +6161,7 @@
         <w:pStyle w:val="Caption"/>
         <w:jc w:val="center"/>
       </w:pPr>
-      <w:bookmarkStart w:id="23" w:name="_Toc235720222"/>
+      <w:bookmarkStart w:id="23" w:name="_Toc235720313"/>
       <w:r>
         <w:t xml:space="preserve">Figure </w:t>
       </w:r>
@@ -6212,7 +6197,7 @@
           <w:noProof/>
         </w:rPr>
         <w:drawing>
-          <wp:inline distT="0" distB="0" distL="0" distR="0" wp14:anchorId="79FDE331" wp14:editId="1C01CF3B">
+          <wp:inline distT="0" distB="0" distL="0" distR="0" wp14:anchorId="17F64BFD" wp14:editId="5ECDF03E">
             <wp:extent cx="5394960" cy="1541417"/>
             <wp:effectExtent l="0" t="0" r="0" b="0"/>
             <wp:docPr id="2" name="Picture 2"/>
@@ -6253,7 +6238,7 @@
         <w:pStyle w:val="Caption"/>
         <w:jc w:val="center"/>
       </w:pPr>
-      <w:bookmarkStart w:id="24" w:name="_Toc235720223"/>
+      <w:bookmarkStart w:id="24" w:name="_Toc235720314"/>
       <w:r>
         <w:t xml:space="preserve">Figure </w:t>
       </w:r>
@@ -6289,7 +6274,7 @@
       <w:pPr>
         <w:pStyle w:val="Heading2"/>
       </w:pPr>
-      <w:bookmarkStart w:id="25" w:name="_Toc235720205"/>
+      <w:bookmarkStart w:id="25" w:name="_Toc235720296"/>
       <w:r>
         <w:rPr>
           <w:rFonts w:ascii="Times New Roman" w:hAnsi="Times New Roman"/>
@@ -6308,7 +6293,7 @@
           <w:noProof/>
         </w:rPr>
         <w:drawing>
-          <wp:inline distT="0" distB="0" distL="0" distR="0" wp14:anchorId="0C77CACD" wp14:editId="6AABCF12">
+          <wp:inline distT="0" distB="0" distL="0" distR="0" wp14:anchorId="1D86515E" wp14:editId="44EC4AA1">
             <wp:extent cx="5394960" cy="2877312"/>
             <wp:effectExtent l="0" t="0" r="0" b="0"/>
             <wp:docPr id="3" name="Picture 3"/>
@@ -6349,7 +6334,7 @@
         <w:pStyle w:val="Caption"/>
         <w:jc w:val="center"/>
       </w:pPr>
-      <w:bookmarkStart w:id="26" w:name="_Toc235720224"/>
+      <w:bookmarkStart w:id="26" w:name="_Toc235720315"/>
       <w:r>
         <w:t xml:space="preserve">Figure </w:t>
       </w:r>
@@ -6385,7 +6370,7 @@
       <w:pPr>
         <w:pStyle w:val="Heading2"/>
       </w:pPr>
-      <w:bookmarkStart w:id="27" w:name="_Toc235720206"/>
+      <w:bookmarkStart w:id="27" w:name="_Toc235720297"/>
       <w:r>
         <w:rPr>
           <w:rFonts w:ascii="Times New Roman" w:hAnsi="Times New Roman"/>
@@ -6404,7 +6389,7 @@
           <w:noProof/>
         </w:rPr>
         <w:drawing>
-          <wp:inline distT="0" distB="0" distL="0" distR="0" wp14:anchorId="5C33D302" wp14:editId="4B32DC07">
+          <wp:inline distT="0" distB="0" distL="0" distR="0" wp14:anchorId="37F7E745" wp14:editId="3C70014E">
             <wp:extent cx="5394960" cy="4495800"/>
             <wp:effectExtent l="0" t="0" r="0" b="0"/>
             <wp:docPr id="4" name="Picture 4"/>
@@ -6445,7 +6430,7 @@
         <w:pStyle w:val="Caption"/>
         <w:jc w:val="center"/>
       </w:pPr>
-      <w:bookmarkStart w:id="28" w:name="_Toc235720225"/>
+      <w:bookmarkStart w:id="28" w:name="_Toc235720316"/>
       <w:r>
         <w:t xml:space="preserve">Figure </w:t>
       </w:r>
@@ -6481,7 +6466,7 @@
           <w:noProof/>
         </w:rPr>
         <w:drawing>
-          <wp:inline distT="0" distB="0" distL="0" distR="0" wp14:anchorId="792FCC62" wp14:editId="39C0D59F">
+          <wp:inline distT="0" distB="0" distL="0" distR="0" wp14:anchorId="2FEEF2DD" wp14:editId="7CE7E6D7">
             <wp:extent cx="4572000" cy="2857500"/>
             <wp:effectExtent l="0" t="0" r="0" b="0"/>
             <wp:docPr id="5" name="Picture 5"/>
@@ -6522,7 +6507,7 @@
         <w:pStyle w:val="Caption"/>
         <w:jc w:val="center"/>
       </w:pPr>
-      <w:bookmarkStart w:id="29" w:name="_Toc235720226"/>
+      <w:bookmarkStart w:id="29" w:name="_Toc235720317"/>
       <w:r>
         <w:t xml:space="preserve">Figure </w:t>
       </w:r>
@@ -6560,7 +6545,7 @@
         <w:pStyle w:val="Caption"/>
         <w:jc w:val="center"/>
       </w:pPr>
-      <w:bookmarkStart w:id="30" w:name="_Toc235720236"/>
+      <w:bookmarkStart w:id="30" w:name="_Toc235720327"/>
       <w:r>
         <w:t xml:space="preserve">Table </w:t>
       </w:r>
@@ -7055,7 +7040,7 @@
       <w:pPr>
         <w:pStyle w:val="Heading1"/>
       </w:pPr>
-      <w:bookmarkStart w:id="31" w:name="_Toc235720207"/>
+      <w:bookmarkStart w:id="31" w:name="_Toc235720298"/>
       <w:r>
         <w:rPr>
           <w:rFonts w:ascii="Times New Roman" w:hAnsi="Times New Roman"/>
@@ -7069,7 +7054,7 @@
       <w:pPr>
         <w:pStyle w:val="Heading2"/>
       </w:pPr>
-      <w:bookmarkStart w:id="32" w:name="_Toc235720208"/>
+      <w:bookmarkStart w:id="32" w:name="_Toc235720299"/>
       <w:r>
         <w:rPr>
           <w:rFonts w:ascii="Times New Roman" w:hAnsi="Times New Roman"/>
@@ -7083,7 +7068,7 @@
         <w:pStyle w:val="Caption"/>
         <w:jc w:val="center"/>
       </w:pPr>
-      <w:bookmarkStart w:id="33" w:name="_Toc235720237"/>
+      <w:bookmarkStart w:id="33" w:name="_Toc235720328"/>
       <w:r>
         <w:t xml:space="preserve">Table </w:t>
       </w:r>
@@ -7923,7 +7908,7 @@
           <w:noProof/>
         </w:rPr>
         <w:drawing>
-          <wp:inline distT="0" distB="0" distL="0" distR="0" wp14:anchorId="35CFFEB8" wp14:editId="076B970A">
+          <wp:inline distT="0" distB="0" distL="0" distR="0" wp14:anchorId="678FCF26" wp14:editId="130AC730">
             <wp:extent cx="5394960" cy="2074985"/>
             <wp:effectExtent l="0" t="0" r="0" b="0"/>
             <wp:docPr id="6" name="Picture 6"/>
@@ -7964,7 +7949,7 @@
         <w:pStyle w:val="Caption"/>
         <w:jc w:val="center"/>
       </w:pPr>
-      <w:bookmarkStart w:id="34" w:name="_Toc235720227"/>
+      <w:bookmarkStart w:id="34" w:name="_Toc235720318"/>
       <w:r>
         <w:t xml:space="preserve">Figure </w:t>
       </w:r>
@@ -8004,7 +7989,7 @@
       <w:pPr>
         <w:pStyle w:val="Heading2"/>
       </w:pPr>
-      <w:bookmarkStart w:id="35" w:name="_Toc235720209"/>
+      <w:bookmarkStart w:id="35" w:name="_Toc235720300"/>
       <w:r>
         <w:rPr>
           <w:rFonts w:ascii="Times New Roman" w:hAnsi="Times New Roman"/>
@@ -8022,7 +8007,7 @@
           <w:noProof/>
         </w:rPr>
         <w:drawing>
-          <wp:inline distT="0" distB="0" distL="0" distR="0" wp14:anchorId="458E04F8" wp14:editId="7461699E">
+          <wp:inline distT="0" distB="0" distL="0" distR="0" wp14:anchorId="1F8842DF" wp14:editId="497A34F6">
             <wp:extent cx="3657600" cy="2926080"/>
             <wp:effectExtent l="0" t="0" r="0" b="0"/>
             <wp:docPr id="7" name="Picture 7"/>
@@ -8063,7 +8048,7 @@
         <w:pStyle w:val="Caption"/>
         <w:jc w:val="center"/>
       </w:pPr>
-      <w:bookmarkStart w:id="36" w:name="_Toc235720228"/>
+      <w:bookmarkStart w:id="36" w:name="_Toc235720319"/>
       <w:r>
         <w:t xml:space="preserve">Figure </w:t>
       </w:r>
@@ -8102,7 +8087,7 @@
       <w:pPr>
         <w:pStyle w:val="Heading1"/>
       </w:pPr>
-      <w:bookmarkStart w:id="37" w:name="_Toc235720210"/>
+      <w:bookmarkStart w:id="37" w:name="_Toc235720301"/>
       <w:r>
         <w:rPr>
           <w:rFonts w:ascii="Times New Roman" w:hAnsi="Times New Roman"/>
@@ -8116,7 +8101,7 @@
       <w:pPr>
         <w:pStyle w:val="Heading2"/>
       </w:pPr>
-      <w:bookmarkStart w:id="38" w:name="_Toc235720211"/>
+      <w:bookmarkStart w:id="38" w:name="_Toc235720302"/>
       <w:r>
         <w:rPr>
           <w:rFonts w:ascii="Times New Roman" w:hAnsi="Times New Roman"/>
@@ -8134,7 +8119,7 @@
           <w:noProof/>
         </w:rPr>
         <w:drawing>
-          <wp:inline distT="0" distB="0" distL="0" distR="0" wp14:anchorId="581DD632" wp14:editId="0BAF297D">
+          <wp:inline distT="0" distB="0" distL="0" distR="0" wp14:anchorId="704E93EF" wp14:editId="118E3E79">
             <wp:extent cx="5394960" cy="4046220"/>
             <wp:effectExtent l="0" t="0" r="0" b="0"/>
             <wp:docPr id="8" name="Picture 8"/>
@@ -8175,7 +8160,7 @@
         <w:pStyle w:val="Caption"/>
         <w:jc w:val="center"/>
       </w:pPr>
-      <w:bookmarkStart w:id="39" w:name="_Toc235720229"/>
+      <w:bookmarkStart w:id="39" w:name="_Toc235720320"/>
       <w:r>
         <w:t xml:space="preserve">Figure </w:t>
       </w:r>
@@ -8207,7 +8192,7 @@
         <w:pStyle w:val="Caption"/>
         <w:jc w:val="center"/>
       </w:pPr>
-      <w:bookmarkStart w:id="40" w:name="_Toc235720238"/>
+      <w:bookmarkStart w:id="40" w:name="_Toc235720329"/>
       <w:r>
         <w:t xml:space="preserve">Table </w:t>
       </w:r>
@@ -8659,7 +8644,7 @@
       <w:pPr>
         <w:pStyle w:val="Heading2"/>
       </w:pPr>
-      <w:bookmarkStart w:id="41" w:name="_Toc235720212"/>
+      <w:bookmarkStart w:id="41" w:name="_Toc235720303"/>
       <w:r>
         <w:rPr>
           <w:rFonts w:ascii="Times New Roman" w:hAnsi="Times New Roman"/>
@@ -8677,7 +8662,7 @@
           <w:noProof/>
         </w:rPr>
         <w:drawing>
-          <wp:inline distT="0" distB="0" distL="0" distR="0" wp14:anchorId="59D75469" wp14:editId="34CE1C3B">
+          <wp:inline distT="0" distB="0" distL="0" distR="0" wp14:anchorId="18FF6B2C" wp14:editId="19BF27D7">
             <wp:extent cx="4754880" cy="4457700"/>
             <wp:effectExtent l="0" t="0" r="0" b="0"/>
             <wp:docPr id="9" name="Picture 9"/>
@@ -8718,7 +8703,7 @@
         <w:pStyle w:val="Caption"/>
         <w:jc w:val="center"/>
       </w:pPr>
-      <w:bookmarkStart w:id="42" w:name="_Toc235720230"/>
+      <w:bookmarkStart w:id="42" w:name="_Toc235720321"/>
       <w:r>
         <w:t xml:space="preserve">Figure </w:t>
       </w:r>
@@ -8755,7 +8740,7 @@
         </w:rPr>
         <w:lastRenderedPageBreak/>
         <w:drawing>
-          <wp:inline distT="0" distB="0" distL="0" distR="0" wp14:anchorId="621DE656" wp14:editId="301A6874">
+          <wp:inline distT="0" distB="0" distL="0" distR="0" wp14:anchorId="55682710" wp14:editId="17AF875A">
             <wp:extent cx="4572000" cy="4286250"/>
             <wp:effectExtent l="0" t="0" r="0" b="0"/>
             <wp:docPr id="10" name="Picture 10"/>
@@ -8796,7 +8781,7 @@
         <w:pStyle w:val="Caption"/>
         <w:jc w:val="center"/>
       </w:pPr>
-      <w:bookmarkStart w:id="43" w:name="_Toc235720231"/>
+      <w:bookmarkStart w:id="43" w:name="_Toc235720322"/>
       <w:r>
         <w:t xml:space="preserve">Figure </w:t>
       </w:r>
@@ -8832,7 +8817,7 @@
       <w:pPr>
         <w:pStyle w:val="Heading2"/>
       </w:pPr>
-      <w:bookmarkStart w:id="44" w:name="_Toc235720213"/>
+      <w:bookmarkStart w:id="44" w:name="_Toc235720304"/>
       <w:r>
         <w:rPr>
           <w:rFonts w:ascii="Times New Roman" w:hAnsi="Times New Roman"/>
@@ -8851,7 +8836,7 @@
           <w:noProof/>
         </w:rPr>
         <w:drawing>
-          <wp:inline distT="0" distB="0" distL="0" distR="0" wp14:anchorId="0026039C" wp14:editId="4D652680">
+          <wp:inline distT="0" distB="0" distL="0" distR="0" wp14:anchorId="43E848CF" wp14:editId="413E011F">
             <wp:extent cx="5394960" cy="3082834"/>
             <wp:effectExtent l="0" t="0" r="0" b="0"/>
             <wp:docPr id="11" name="Picture 11"/>
@@ -8892,7 +8877,7 @@
         <w:pStyle w:val="Caption"/>
         <w:jc w:val="center"/>
       </w:pPr>
-      <w:bookmarkStart w:id="45" w:name="_Toc235720232"/>
+      <w:bookmarkStart w:id="45" w:name="_Toc235720323"/>
       <w:r>
         <w:t xml:space="preserve">Figure </w:t>
       </w:r>
@@ -8928,7 +8913,7 @@
       <w:pPr>
         <w:pStyle w:val="Heading1"/>
       </w:pPr>
-      <w:bookmarkStart w:id="46" w:name="_Toc235720214"/>
+      <w:bookmarkStart w:id="46" w:name="_Toc235720305"/>
       <w:r>
         <w:rPr>
           <w:rFonts w:ascii="Times New Roman" w:hAnsi="Times New Roman"/>
@@ -8942,7 +8927,7 @@
       <w:pPr>
         <w:pStyle w:val="Heading2"/>
       </w:pPr>
-      <w:bookmarkStart w:id="47" w:name="_Toc235720215"/>
+      <w:bookmarkStart w:id="47" w:name="_Toc235720306"/>
       <w:r>
         <w:rPr>
           <w:rFonts w:ascii="Times New Roman" w:hAnsi="Times New Roman"/>
@@ -9000,7 +8985,7 @@
       <w:pPr>
         <w:pStyle w:val="Heading2"/>
       </w:pPr>
-      <w:bookmarkStart w:id="48" w:name="_Toc235720216"/>
+      <w:bookmarkStart w:id="48" w:name="_Toc235720307"/>
       <w:r>
         <w:rPr>
           <w:rFonts w:ascii="Times New Roman" w:hAnsi="Times New Roman"/>
@@ -9014,7 +8999,7 @@
         <w:pStyle w:val="Caption"/>
         <w:jc w:val="center"/>
       </w:pPr>
-      <w:bookmarkStart w:id="49" w:name="_Toc235720239"/>
+      <w:bookmarkStart w:id="49" w:name="_Toc235720330"/>
       <w:r>
         <w:t xml:space="preserve">Table </w:t>
       </w:r>
@@ -9385,7 +9370,7 @@
       <w:pPr>
         <w:pStyle w:val="Heading1"/>
       </w:pPr>
-      <w:bookmarkStart w:id="50" w:name="_Toc235720217"/>
+      <w:bookmarkStart w:id="50" w:name="_Toc235720308"/>
       <w:r>
         <w:rPr>
           <w:rFonts w:ascii="Times New Roman" w:hAnsi="Times New Roman"/>
@@ -9444,7 +9429,7 @@
       <w:pPr>
         <w:pStyle w:val="Heading1"/>
       </w:pPr>
-      <w:bookmarkStart w:id="51" w:name="_Toc235720218"/>
+      <w:bookmarkStart w:id="51" w:name="_Toc235720309"/>
       <w:r>
         <w:rPr>
           <w:rFonts w:ascii="Times New Roman" w:hAnsi="Times New Roman"/>
@@ -9466,7 +9451,7 @@
       <w:pPr>
         <w:pStyle w:val="Heading1"/>
       </w:pPr>
-      <w:bookmarkStart w:id="52" w:name="_Toc235720219"/>
+      <w:bookmarkStart w:id="52" w:name="_Toc235720310"/>
       <w:r>
         <w:rPr>
           <w:rFonts w:ascii="Times New Roman" w:hAnsi="Times New Roman"/>
@@ -9560,7 +9545,7 @@
       <w:pPr>
         <w:pStyle w:val="Heading1"/>
       </w:pPr>
-      <w:bookmarkStart w:id="53" w:name="_Toc235720220"/>
+      <w:bookmarkStart w:id="53" w:name="_Toc235720311"/>
       <w:r>
         <w:rPr>
           <w:rFonts w:ascii="Times New Roman" w:hAnsi="Times New Roman"/>
@@ -9624,7 +9609,7 @@
       <w:pPr>
         <w:pStyle w:val="Heading1"/>
       </w:pPr>
-      <w:bookmarkStart w:id="54" w:name="_Toc235720221"/>
+      <w:bookmarkStart w:id="54" w:name="_Toc235720312"/>
       <w:r>
         <w:rPr>
           <w:rFonts w:ascii="Times New Roman" w:hAnsi="Times New Roman"/>
@@ -9639,7 +9624,7 @@
         <w:pStyle w:val="Caption"/>
         <w:jc w:val="center"/>
       </w:pPr>
-      <w:bookmarkStart w:id="55" w:name="_Toc235720240"/>
+      <w:bookmarkStart w:id="55" w:name="_Toc235720331"/>
       <w:r>
         <w:t xml:space="preserve">Table </w:t>
       </w:r>
@@ -10258,31 +10243,31 @@
       </w:rPr>
     </w:lvl>
   </w:abstractNum>
-  <w:num w:numId="1" w16cid:durableId="751898713">
+  <w:num w:numId="1" w16cid:durableId="1739206195">
     <w:abstractNumId w:val="8"/>
   </w:num>
-  <w:num w:numId="2" w16cid:durableId="665472806">
+  <w:num w:numId="2" w16cid:durableId="1962688143">
     <w:abstractNumId w:val="6"/>
   </w:num>
-  <w:num w:numId="3" w16cid:durableId="1286353215">
+  <w:num w:numId="3" w16cid:durableId="1732001684">
     <w:abstractNumId w:val="5"/>
   </w:num>
-  <w:num w:numId="4" w16cid:durableId="839392005">
+  <w:num w:numId="4" w16cid:durableId="2048681018">
     <w:abstractNumId w:val="4"/>
   </w:num>
-  <w:num w:numId="5" w16cid:durableId="2061853600">
+  <w:num w:numId="5" w16cid:durableId="1268729946">
     <w:abstractNumId w:val="7"/>
   </w:num>
-  <w:num w:numId="6" w16cid:durableId="863444871">
+  <w:num w:numId="6" w16cid:durableId="642471741">
     <w:abstractNumId w:val="3"/>
   </w:num>
-  <w:num w:numId="7" w16cid:durableId="451942083">
+  <w:num w:numId="7" w16cid:durableId="1371341871">
     <w:abstractNumId w:val="2"/>
   </w:num>
-  <w:num w:numId="8" w16cid:durableId="429277226">
+  <w:num w:numId="8" w16cid:durableId="201750339">
     <w:abstractNumId w:val="1"/>
   </w:num>
-  <w:num w:numId="9" w16cid:durableId="1612204427">
+  <w:num w:numId="9" w16cid:durableId="940719362">
     <w:abstractNumId w:val="0"/>
   </w:num>
 </w:numbering>
@@ -21686,7 +21671,7 @@
     <w:autoRedefine/>
     <w:uiPriority w:val="39"/>
     <w:unhideWhenUsed/>
-    <w:rsid w:val="00243B7E"/>
+    <w:rsid w:val="00EB36FA"/>
     <w:pPr>
       <w:spacing w:after="100"/>
     </w:pPr>
@@ -21698,7 +21683,7 @@
     <w:autoRedefine/>
     <w:uiPriority w:val="39"/>
     <w:unhideWhenUsed/>
-    <w:rsid w:val="00243B7E"/>
+    <w:rsid w:val="00EB36FA"/>
     <w:pPr>
       <w:spacing w:after="100"/>
       <w:ind w:left="240"/>
@@ -21709,7 +21694,7 @@
     <w:basedOn w:val="DefaultParagraphFont"/>
     <w:uiPriority w:val="99"/>
     <w:unhideWhenUsed/>
-    <w:rsid w:val="00243B7E"/>
+    <w:rsid w:val="00EB36FA"/>
     <w:rPr>
       <w:color w:val="0000FF" w:themeColor="hyperlink"/>
       <w:u w:val="single"/>
@@ -21721,7 +21706,7 @@
     <w:next w:val="Normal"/>
     <w:uiPriority w:val="99"/>
     <w:unhideWhenUsed/>
-    <w:rsid w:val="00243B7E"/>
+    <w:rsid w:val="00EB36FA"/>
     <w:pPr>
       <w:spacing w:after="0"/>
     </w:pPr>

</xml_diff>